<commit_message>
update biểu đồ và report thực nghiệm
</commit_message>
<xml_diff>
--- a/DUANCNTT_Editing.docx
+++ b/DUANCNTT_Editing.docx
@@ -787,8 +787,8 @@
       <w:bookmarkEnd w:id="4"/>
       <w:bookmarkStart w:id="5" w:name="_1k4jp0cu36mv" w:colFirst="0" w:colLast="0"/>
       <w:bookmarkEnd w:id="5"/>
-      <w:bookmarkStart w:id="6" w:name="_Toc7028"/>
-      <w:bookmarkStart w:id="7" w:name="_Toc23840"/>
+      <w:bookmarkStart w:id="6" w:name="_Toc23840"/>
+      <w:bookmarkStart w:id="7" w:name="_Toc7028"/>
       <w:r>
         <w:br w:type="page"/>
       </w:r>
@@ -823,8 +823,8 @@
       <w:bookmarkStart w:id="9" w:name="_30j0zll" w:colFirst="0" w:colLast="0"/>
       <w:bookmarkEnd w:id="9"/>
       <w:bookmarkStart w:id="10" w:name="_Toc24481"/>
-      <w:bookmarkStart w:id="11" w:name="_Toc29049"/>
-      <w:bookmarkStart w:id="12" w:name="_Toc12390"/>
+      <w:bookmarkStart w:id="11" w:name="_Toc12390"/>
+      <w:bookmarkStart w:id="12" w:name="_Toc29049"/>
       <w:r>
         <w:rPr>
           <w:rFonts w:ascii="Times New Roman" w:hAnsi="Times New Roman" w:cs="Times New Roman"/>
@@ -1066,8 +1066,8 @@
       </w:pPr>
       <w:bookmarkStart w:id="13" w:name="_1fob9te" w:colFirst="0" w:colLast="0"/>
       <w:bookmarkEnd w:id="13"/>
-      <w:bookmarkStart w:id="14" w:name="_Toc21169"/>
-      <w:bookmarkStart w:id="15" w:name="_Toc19411"/>
+      <w:bookmarkStart w:id="14" w:name="_Toc19411"/>
+      <w:bookmarkStart w:id="15" w:name="_Toc21169"/>
       <w:r>
         <w:rPr>
           <w:rFonts w:ascii="Times New Roman" w:hAnsi="Times New Roman" w:cs="Times New Roman"/>
@@ -1152,8 +1152,8 @@
           <w:rFonts w:ascii="Times New Roman" w:hAnsi="Times New Roman" w:cs="Times New Roman"/>
         </w:rPr>
       </w:pPr>
-      <w:bookmarkStart w:id="16" w:name="_Toc15347"/>
-      <w:bookmarkStart w:id="17" w:name="_Toc25371"/>
+      <w:bookmarkStart w:id="16" w:name="_Toc25371"/>
+      <w:bookmarkStart w:id="17" w:name="_Toc15347"/>
       <w:r>
         <w:rPr>
           <w:rFonts w:ascii="Times New Roman" w:hAnsi="Times New Roman" w:cs="Times New Roman"/>
@@ -8234,8 +8234,6 @@
       <w:r>
         <w:br w:type="page"/>
       </w:r>
-      <w:bookmarkStart w:id="299" w:name="_GoBack"/>
-      <w:bookmarkEnd w:id="299"/>
     </w:p>
     <w:p>
       <w:pPr>
@@ -8245,8 +8243,8 @@
           <w:rFonts w:ascii="Times New Roman" w:hAnsi="Times New Roman" w:cs="Times New Roman"/>
         </w:rPr>
       </w:pPr>
-      <w:bookmarkStart w:id="21" w:name="_Toc7505"/>
-      <w:bookmarkStart w:id="22" w:name="_Toc1109"/>
+      <w:bookmarkStart w:id="21" w:name="_Toc1109"/>
+      <w:bookmarkStart w:id="22" w:name="_Toc7505"/>
       <w:r>
         <w:rPr>
           <w:rFonts w:ascii="Times New Roman" w:hAnsi="Times New Roman" w:cs="Times New Roman"/>
@@ -8291,6 +8289,12 @@
             <w:insideH w:val="none" w:color="auto" w:sz="0" w:space="0"/>
             <w:insideV w:val="none" w:color="auto" w:sz="0" w:space="0"/>
           </w:tblBorders>
+          <w:tblCellMar>
+            <w:top w:w="0" w:type="dxa"/>
+            <w:left w:w="108" w:type="dxa"/>
+            <w:bottom w:w="0" w:type="dxa"/>
+            <w:right w:w="108" w:type="dxa"/>
+          </w:tblCellMar>
         </w:tblPrEx>
         <w:tc>
           <w:tcPr>
@@ -8512,6 +8516,12 @@
             <w:insideH w:val="none" w:color="auto" w:sz="0" w:space="0"/>
             <w:insideV w:val="none" w:color="auto" w:sz="0" w:space="0"/>
           </w:tblBorders>
+          <w:tblCellMar>
+            <w:top w:w="0" w:type="dxa"/>
+            <w:left w:w="108" w:type="dxa"/>
+            <w:bottom w:w="0" w:type="dxa"/>
+            <w:right w:w="108" w:type="dxa"/>
+          </w:tblCellMar>
         </w:tblPrEx>
         <w:tc>
           <w:tcPr>
@@ -9579,8 +9589,8 @@
         <w:spacing w:after="120"/>
       </w:pPr>
       <w:bookmarkStart w:id="25" w:name="_Toc3102"/>
-      <w:bookmarkStart w:id="26" w:name="_Toc26131"/>
-      <w:bookmarkStart w:id="27" w:name="_Toc20137"/>
+      <w:bookmarkStart w:id="26" w:name="_Toc20137"/>
+      <w:bookmarkStart w:id="27" w:name="_Toc26131"/>
       <w:r>
         <w:t>Implementation Context (Focusing on Transport, Culture, and Tourism)</w:t>
       </w:r>
@@ -9768,9 +9778,9 @@
           <w:rFonts w:ascii="Times New Roman" w:hAnsi="Times New Roman" w:cs="Times New Roman"/>
         </w:rPr>
       </w:pPr>
-      <w:bookmarkStart w:id="34" w:name="_Toc32612"/>
-      <w:bookmarkStart w:id="35" w:name="_Toc27018"/>
-      <w:bookmarkStart w:id="36" w:name="_Toc12427"/>
+      <w:bookmarkStart w:id="34" w:name="_Toc12427"/>
+      <w:bookmarkStart w:id="35" w:name="_Toc32612"/>
+      <w:bookmarkStart w:id="36" w:name="_Toc27018"/>
       <w:r>
         <w:rPr>
           <w:rFonts w:ascii="Times New Roman" w:hAnsi="Times New Roman" w:cs="Times New Roman"/>
@@ -10502,9 +10512,9 @@
         <w:pStyle w:val="3"/>
         <w:jc w:val="both"/>
       </w:pPr>
-      <w:bookmarkStart w:id="43" w:name="_Toc4797"/>
-      <w:bookmarkStart w:id="44" w:name="_Toc13764"/>
-      <w:bookmarkStart w:id="45" w:name="_Toc29022"/>
+      <w:bookmarkStart w:id="43" w:name="_Toc13764"/>
+      <w:bookmarkStart w:id="44" w:name="_Toc29022"/>
+      <w:bookmarkStart w:id="45" w:name="_Toc4797"/>
       <w:r>
         <w:t>2.3 Novelty and User Appeal</w:t>
       </w:r>
@@ -10841,8 +10851,8 @@
         <w:jc w:val="both"/>
       </w:pPr>
       <w:bookmarkStart w:id="55" w:name="_Toc21210"/>
-      <w:bookmarkStart w:id="56" w:name="_Toc19655"/>
-      <w:bookmarkStart w:id="57" w:name="_Toc7167"/>
+      <w:bookmarkStart w:id="56" w:name="_Toc7167"/>
+      <w:bookmarkStart w:id="57" w:name="_Toc19655"/>
       <w:r>
         <w:t>3.1.2 Operating Principle:</w:t>
       </w:r>
@@ -11006,8 +11016,8 @@
         <w:pStyle w:val="4"/>
         <w:jc w:val="both"/>
       </w:pPr>
-      <w:bookmarkStart w:id="58" w:name="_Toc11759"/>
-      <w:bookmarkStart w:id="59" w:name="_Toc796"/>
+      <w:bookmarkStart w:id="58" w:name="_Toc796"/>
+      <w:bookmarkStart w:id="59" w:name="_Toc11759"/>
       <w:bookmarkStart w:id="60" w:name="_Toc11272"/>
       <w:r>
         <w:t>3.1.3 Advantages and Limitations of LLMs:</w:t>
@@ -11245,9 +11255,9 @@
         <w:pStyle w:val="4"/>
         <w:jc w:val="both"/>
       </w:pPr>
-      <w:bookmarkStart w:id="61" w:name="_Toc11763"/>
-      <w:bookmarkStart w:id="62" w:name="_Toc30843"/>
-      <w:bookmarkStart w:id="63" w:name="_Toc18620"/>
+      <w:bookmarkStart w:id="61" w:name="_Toc18620"/>
+      <w:bookmarkStart w:id="62" w:name="_Toc11763"/>
+      <w:bookmarkStart w:id="63" w:name="_Toc30843"/>
       <w:r>
         <w:t>3.1.4 Training Procedure for Popular Large Language Models</w:t>
       </w:r>
@@ -11435,8 +11445,8 @@
         <w:pStyle w:val="4"/>
         <w:jc w:val="both"/>
       </w:pPr>
-      <w:bookmarkStart w:id="64" w:name="_Toc13782"/>
-      <w:bookmarkStart w:id="65" w:name="_Toc7133"/>
+      <w:bookmarkStart w:id="64" w:name="_Toc7133"/>
+      <w:bookmarkStart w:id="65" w:name="_Toc13782"/>
       <w:bookmarkStart w:id="66" w:name="_Toc24051"/>
       <w:r>
         <w:t>3.1.5 Real-World Applications of LLMs</w:t>
@@ -11735,8 +11745,8 @@
         <w:jc w:val="both"/>
         <w:outlineLvl w:val="0"/>
       </w:pPr>
-      <w:bookmarkStart w:id="67" w:name="_Toc19364"/>
-      <w:bookmarkStart w:id="68" w:name="_Toc12569"/>
+      <w:bookmarkStart w:id="67" w:name="_Toc12569"/>
+      <w:bookmarkStart w:id="68" w:name="_Toc19364"/>
       <w:bookmarkStart w:id="69" w:name="_Toc16126"/>
       <w:r>
         <w:t>3.2 Overview of Knowledge Graphs:</w:t>
@@ -11811,8 +11821,8 @@
         <w:jc w:val="both"/>
       </w:pPr>
       <w:bookmarkStart w:id="70" w:name="_Toc8180"/>
-      <w:bookmarkStart w:id="71" w:name="_Toc9838"/>
-      <w:bookmarkStart w:id="72" w:name="_Toc4880"/>
+      <w:bookmarkStart w:id="71" w:name="_Toc4880"/>
+      <w:bookmarkStart w:id="72" w:name="_Toc9838"/>
       <w:r>
         <w:t>3.2.1 Graph Theory:</w:t>
       </w:r>
@@ -11966,8 +11976,8 @@
         <w:jc w:val="both"/>
         <w:outlineLvl w:val="0"/>
       </w:pPr>
-      <w:bookmarkStart w:id="73" w:name="_Toc9168"/>
-      <w:bookmarkStart w:id="74" w:name="_Toc24474"/>
+      <w:bookmarkStart w:id="73" w:name="_Toc24474"/>
+      <w:bookmarkStart w:id="74" w:name="_Toc9168"/>
       <w:bookmarkStart w:id="75" w:name="_Toc30550"/>
       <w:r>
         <w:t>3.3 Retrieval-Augmented Generation (RAG):</w:t>
@@ -11981,9 +11991,9 @@
         <w:pStyle w:val="4"/>
         <w:bidi w:val="0"/>
       </w:pPr>
-      <w:bookmarkStart w:id="76" w:name="_Toc15134"/>
+      <w:bookmarkStart w:id="76" w:name="_Toc16871"/>
       <w:bookmarkStart w:id="77" w:name="_Toc6553"/>
-      <w:bookmarkStart w:id="78" w:name="_Toc16871"/>
+      <w:bookmarkStart w:id="78" w:name="_Toc15134"/>
       <w:bookmarkStart w:id="79" w:name="_Toc19208"/>
       <w:r>
         <w:t>3.3.1 What is RAG?</w:t>
@@ -12106,9 +12116,9 @@
         <w:pStyle w:val="4"/>
         <w:bidi w:val="0"/>
       </w:pPr>
-      <w:bookmarkStart w:id="80" w:name="_Toc12314"/>
+      <w:bookmarkStart w:id="80" w:name="_Toc23910"/>
       <w:bookmarkStart w:id="81" w:name="_Toc29068"/>
-      <w:bookmarkStart w:id="82" w:name="_Toc23910"/>
+      <w:bookmarkStart w:id="82" w:name="_Toc12314"/>
       <w:bookmarkStart w:id="83" w:name="_Toc26615"/>
       <w:r>
         <w:t>3.3.2 Why is RAG important ?</w:t>
@@ -12464,9 +12474,9 @@
         <w:bidi w:val="0"/>
       </w:pPr>
       <w:bookmarkStart w:id="88" w:name="_Toc21474"/>
-      <w:bookmarkStart w:id="89" w:name="_Toc30180"/>
-      <w:bookmarkStart w:id="90" w:name="_Toc3729"/>
-      <w:bookmarkStart w:id="91" w:name="_Toc25105"/>
+      <w:bookmarkStart w:id="89" w:name="_Toc3729"/>
+      <w:bookmarkStart w:id="90" w:name="_Toc25105"/>
+      <w:bookmarkStart w:id="91" w:name="_Toc30180"/>
       <w:r>
         <w:t>3.3.4 RAG Workflow:</w:t>
       </w:r>
@@ -12660,9 +12670,9 @@
         <w:pStyle w:val="3"/>
         <w:jc w:val="both"/>
       </w:pPr>
-      <w:bookmarkStart w:id="95" w:name="_Toc13732"/>
-      <w:bookmarkStart w:id="96" w:name="_Toc10599"/>
-      <w:bookmarkStart w:id="97" w:name="_Toc12500"/>
+      <w:bookmarkStart w:id="95" w:name="_Toc12500"/>
+      <w:bookmarkStart w:id="96" w:name="_Toc13732"/>
+      <w:bookmarkStart w:id="97" w:name="_Toc10599"/>
       <w:r>
         <w:t>3.4 Retrieval</w:t>
       </w:r>
@@ -12675,9 +12685,9 @@
         <w:pStyle w:val="4"/>
         <w:bidi w:val="0"/>
       </w:pPr>
-      <w:bookmarkStart w:id="98" w:name="_Toc498"/>
-      <w:bookmarkStart w:id="99" w:name="_Toc20101"/>
-      <w:bookmarkStart w:id="100" w:name="_Toc3552"/>
+      <w:bookmarkStart w:id="98" w:name="_Toc3552"/>
+      <w:bookmarkStart w:id="99" w:name="_Toc498"/>
+      <w:bookmarkStart w:id="100" w:name="_Toc20101"/>
       <w:r>
         <w:t>3.4.1 Introduction to the Retrieval Module</w:t>
       </w:r>
@@ -12718,8 +12728,8 @@
         <w:jc w:val="both"/>
       </w:pPr>
       <w:bookmarkStart w:id="101" w:name="_Toc20607"/>
-      <w:bookmarkStart w:id="102" w:name="_Toc13509"/>
-      <w:bookmarkStart w:id="103" w:name="_Toc25685"/>
+      <w:bookmarkStart w:id="102" w:name="_Toc25685"/>
+      <w:bookmarkStart w:id="103" w:name="_Toc13509"/>
       <w:r>
         <w:t>3.4.2 Main Components of the Retrieval Module</w:t>
       </w:r>
@@ -13537,9 +13547,9 @@
         <w:pStyle w:val="4"/>
         <w:jc w:val="both"/>
       </w:pPr>
-      <w:bookmarkStart w:id="107" w:name="_Toc18575"/>
-      <w:bookmarkStart w:id="108" w:name="_Toc30992"/>
-      <w:bookmarkStart w:id="109" w:name="_Toc22290"/>
+      <w:bookmarkStart w:id="107" w:name="_Toc22290"/>
+      <w:bookmarkStart w:id="108" w:name="_Toc18575"/>
+      <w:bookmarkStart w:id="109" w:name="_Toc30992"/>
       <w:r>
         <w:t>3.5.1 Introduction to the Generation Module:</w:t>
       </w:r>
@@ -13570,9 +13580,9 @@
         <w:pStyle w:val="4"/>
         <w:jc w:val="both"/>
       </w:pPr>
-      <w:bookmarkStart w:id="110" w:name="_Toc14743"/>
+      <w:bookmarkStart w:id="110" w:name="_Toc13673"/>
       <w:bookmarkStart w:id="111" w:name="_Toc30437"/>
-      <w:bookmarkStart w:id="112" w:name="_Toc13673"/>
+      <w:bookmarkStart w:id="112" w:name="_Toc14743"/>
       <w:r>
         <w:t>3.5.2 Main Components of the Generation Module:</w:t>
       </w:r>
@@ -14310,9 +14320,9 @@
         <w:pStyle w:val="3"/>
         <w:bidi w:val="0"/>
       </w:pPr>
-      <w:bookmarkStart w:id="113" w:name="_Toc27142"/>
+      <w:bookmarkStart w:id="113" w:name="_Toc32412"/>
       <w:bookmarkStart w:id="114" w:name="_Toc3841"/>
-      <w:bookmarkStart w:id="115" w:name="_Toc32412"/>
+      <w:bookmarkStart w:id="115" w:name="_Toc27142"/>
       <w:r>
         <w:t>3.6 Optimzation and Challenges in RAG</w:t>
       </w:r>
@@ -14326,8 +14336,8 @@
         <w:jc w:val="both"/>
       </w:pPr>
       <w:bookmarkStart w:id="116" w:name="_Toc31186"/>
-      <w:bookmarkStart w:id="117" w:name="_Toc12817"/>
-      <w:bookmarkStart w:id="118" w:name="_Toc30848"/>
+      <w:bookmarkStart w:id="117" w:name="_Toc30848"/>
+      <w:bookmarkStart w:id="118" w:name="_Toc12817"/>
       <w:r>
         <w:t>3.6.1 Optimizing RAG Performance</w:t>
       </w:r>
@@ -14655,9 +14665,9 @@
         <w:pStyle w:val="4"/>
         <w:jc w:val="both"/>
       </w:pPr>
-      <w:bookmarkStart w:id="119" w:name="_Toc12957"/>
+      <w:bookmarkStart w:id="119" w:name="_Toc25115"/>
       <w:bookmarkStart w:id="120" w:name="_Toc14667"/>
-      <w:bookmarkStart w:id="121" w:name="_Toc25115"/>
+      <w:bookmarkStart w:id="121" w:name="_Toc12957"/>
       <w:r>
         <w:t>3.6.2 Challenges in Deploying RAG:</w:t>
       </w:r>
@@ -15095,9 +15105,9 @@
         </w:numPr>
         <w:ind w:left="720" w:leftChars="0"/>
       </w:pPr>
-      <w:bookmarkStart w:id="125" w:name="_Toc8532"/>
-      <w:bookmarkStart w:id="126" w:name="_Toc9415"/>
-      <w:bookmarkStart w:id="127" w:name="_Toc6970"/>
+      <w:bookmarkStart w:id="125" w:name="_Toc9415"/>
+      <w:bookmarkStart w:id="126" w:name="_Toc6970"/>
+      <w:bookmarkStart w:id="127" w:name="_Toc8532"/>
       <w:r>
         <w:t>Motivation for the Contribution:</w:t>
       </w:r>
@@ -15258,9 +15268,9 @@
         </w:numPr>
         <w:bidi w:val="0"/>
       </w:pPr>
-      <w:bookmarkStart w:id="128" w:name="_Toc29052"/>
-      <w:bookmarkStart w:id="129" w:name="_Toc25688"/>
-      <w:bookmarkStart w:id="130" w:name="_Toc13437"/>
+      <w:bookmarkStart w:id="128" w:name="_Toc13437"/>
+      <w:bookmarkStart w:id="129" w:name="_Toc29052"/>
+      <w:bookmarkStart w:id="130" w:name="_Toc25688"/>
       <w:r>
         <w:t>Building a multimodal Q&amp;A system based on RAG in the field of</w:t>
       </w:r>
@@ -15283,10 +15293,10 @@
         <w:pStyle w:val="4"/>
         <w:bidi w:val="0"/>
       </w:pPr>
-      <w:bookmarkStart w:id="131" w:name="_Toc21769"/>
-      <w:bookmarkStart w:id="132" w:name="_Toc7446"/>
-      <w:bookmarkStart w:id="133" w:name="_Toc24028"/>
-      <w:bookmarkStart w:id="134" w:name="_Toc16468"/>
+      <w:bookmarkStart w:id="131" w:name="_Toc16468"/>
+      <w:bookmarkStart w:id="132" w:name="_Toc24028"/>
+      <w:bookmarkStart w:id="133" w:name="_Toc7446"/>
+      <w:bookmarkStart w:id="134" w:name="_Toc21769"/>
       <w:r>
         <w:rPr>
           <w:rFonts w:hint="default"/>
@@ -15365,10 +15375,10 @@
         <w:pStyle w:val="4"/>
         <w:bidi w:val="0"/>
       </w:pPr>
-      <w:bookmarkStart w:id="135" w:name="_Toc8709"/>
-      <w:bookmarkStart w:id="136" w:name="_Toc4992"/>
-      <w:bookmarkStart w:id="137" w:name="_Toc9051"/>
-      <w:bookmarkStart w:id="138" w:name="_Toc20951"/>
+      <w:bookmarkStart w:id="135" w:name="_Toc4992"/>
+      <w:bookmarkStart w:id="136" w:name="_Toc9051"/>
+      <w:bookmarkStart w:id="137" w:name="_Toc20951"/>
+      <w:bookmarkStart w:id="138" w:name="_Toc8709"/>
       <w:r>
         <w:rPr>
           <w:rFonts w:hint="default"/>
@@ -15547,7 +15557,9 @@
         </w:tblBorders>
         <w:tblLayout w:type="autofit"/>
         <w:tblCellMar>
+          <w:top w:w="0" w:type="dxa"/>
           <w:left w:w="108" w:type="dxa"/>
+          <w:bottom w:w="0" w:type="dxa"/>
           <w:right w:w="108" w:type="dxa"/>
         </w:tblCellMar>
       </w:tblPr>
@@ -15567,7 +15579,9 @@
             <w:insideV w:val="single" w:color="auto" w:sz="4" w:space="0"/>
           </w:tblBorders>
           <w:tblCellMar>
+            <w:top w:w="0" w:type="dxa"/>
             <w:left w:w="108" w:type="dxa"/>
+            <w:bottom w:w="0" w:type="dxa"/>
             <w:right w:w="108" w:type="dxa"/>
           </w:tblCellMar>
         </w:tblPrEx>
@@ -15577,6 +15591,7 @@
           </w:tcPr>
           <w:p>
             <w:pPr>
+              <w:widowControl w:val="0"/>
               <w:jc w:val="left"/>
               <w:rPr>
                 <w:rFonts w:hint="default"/>
@@ -15604,6 +15619,7 @@
           </w:tcPr>
           <w:p>
             <w:pPr>
+              <w:widowControl w:val="0"/>
               <w:jc w:val="left"/>
               <w:rPr>
                 <w:rFonts w:hint="default"/>
@@ -15631,6 +15647,7 @@
           </w:tcPr>
           <w:p>
             <w:pPr>
+              <w:widowControl w:val="0"/>
               <w:jc w:val="left"/>
               <w:rPr>
                 <w:rFonts w:hint="default"/>
@@ -15664,7 +15681,9 @@
             <w:insideV w:val="single" w:color="auto" w:sz="4" w:space="0"/>
           </w:tblBorders>
           <w:tblCellMar>
+            <w:top w:w="0" w:type="dxa"/>
             <w:left w:w="108" w:type="dxa"/>
+            <w:bottom w:w="0" w:type="dxa"/>
             <w:right w:w="108" w:type="dxa"/>
           </w:tblCellMar>
         </w:tblPrEx>
@@ -15674,6 +15693,7 @@
           </w:tcPr>
           <w:p>
             <w:pPr>
+              <w:widowControl w:val="0"/>
               <w:jc w:val="left"/>
               <w:rPr>
                 <w:rFonts w:hint="default"/>
@@ -15701,6 +15721,7 @@
           </w:tcPr>
           <w:p>
             <w:pPr>
+              <w:widowControl w:val="0"/>
               <w:jc w:val="left"/>
               <w:rPr>
                 <w:rFonts w:hint="default"/>
@@ -15728,6 +15749,7 @@
           </w:tcPr>
           <w:p>
             <w:pPr>
+              <w:widowControl w:val="0"/>
               <w:numPr>
                 <w:ilvl w:val="0"/>
                 <w:numId w:val="22"/>
@@ -15757,6 +15779,7 @@
           </w:p>
           <w:p>
             <w:pPr>
+              <w:widowControl w:val="0"/>
               <w:numPr>
                 <w:ilvl w:val="0"/>
                 <w:numId w:val="22"/>
@@ -15786,6 +15809,7 @@
           </w:p>
           <w:p>
             <w:pPr>
+              <w:widowControl w:val="0"/>
               <w:numPr>
                 <w:ilvl w:val="0"/>
                 <w:numId w:val="22"/>
@@ -15825,7 +15849,9 @@
             <w:insideV w:val="single" w:color="auto" w:sz="4" w:space="0"/>
           </w:tblBorders>
           <w:tblCellMar>
+            <w:top w:w="0" w:type="dxa"/>
             <w:left w:w="108" w:type="dxa"/>
+            <w:bottom w:w="0" w:type="dxa"/>
             <w:right w:w="108" w:type="dxa"/>
           </w:tblCellMar>
         </w:tblPrEx>
@@ -15838,6 +15864,7 @@
           </w:tcPr>
           <w:p>
             <w:pPr>
+              <w:widowControl w:val="0"/>
               <w:jc w:val="left"/>
               <w:rPr>
                 <w:rFonts w:hint="default"/>
@@ -15865,6 +15892,7 @@
           </w:tcPr>
           <w:p>
             <w:pPr>
+              <w:widowControl w:val="0"/>
               <w:jc w:val="left"/>
               <w:rPr>
                 <w:b/>
@@ -15892,6 +15920,7 @@
           </w:tcPr>
           <w:p>
             <w:pPr>
+              <w:widowControl w:val="0"/>
               <w:jc w:val="left"/>
               <w:rPr>
                 <w:rFonts w:hint="default"/>
@@ -15931,6 +15960,7 @@
           </w:p>
           <w:p>
             <w:pPr>
+              <w:widowControl w:val="0"/>
               <w:numPr>
                 <w:ilvl w:val="0"/>
                 <w:numId w:val="23"/>
@@ -15959,6 +15989,7 @@
           </w:p>
           <w:p>
             <w:pPr>
+              <w:widowControl w:val="0"/>
               <w:numPr>
                 <w:ilvl w:val="0"/>
                 <w:numId w:val="23"/>
@@ -15987,6 +16018,7 @@
           </w:p>
           <w:p>
             <w:pPr>
+              <w:widowControl w:val="0"/>
               <w:numPr>
                 <w:ilvl w:val="0"/>
                 <w:numId w:val="23"/>
@@ -16015,6 +16047,7 @@
           </w:p>
           <w:p>
             <w:pPr>
+              <w:widowControl w:val="0"/>
               <w:numPr>
                 <w:ilvl w:val="0"/>
                 <w:numId w:val="23"/>
@@ -16161,7 +16194,9 @@
         </w:tblBorders>
         <w:tblLayout w:type="fixed"/>
         <w:tblCellMar>
+          <w:top w:w="0" w:type="dxa"/>
           <w:left w:w="108" w:type="dxa"/>
+          <w:bottom w:w="0" w:type="dxa"/>
           <w:right w:w="108" w:type="dxa"/>
         </w:tblCellMar>
       </w:tblPr>
@@ -16182,7 +16217,9 @@
             <w:insideV w:val="single" w:color="auto" w:sz="4" w:space="0"/>
           </w:tblBorders>
           <w:tblCellMar>
+            <w:top w:w="0" w:type="dxa"/>
             <w:left w:w="108" w:type="dxa"/>
+            <w:bottom w:w="0" w:type="dxa"/>
             <w:right w:w="108" w:type="dxa"/>
           </w:tblCellMar>
         </w:tblPrEx>
@@ -16195,6 +16232,7 @@
           </w:tcPr>
           <w:p>
             <w:pPr>
+              <w:widowControl w:val="0"/>
               <w:jc w:val="left"/>
               <w:rPr>
                 <w:rFonts w:hint="default"/>
@@ -16222,6 +16260,7 @@
           </w:tcPr>
           <w:p>
             <w:pPr>
+              <w:widowControl w:val="0"/>
               <w:jc w:val="left"/>
               <w:rPr>
                 <w:rFonts w:hint="default"/>
@@ -16249,6 +16288,7 @@
           </w:tcPr>
           <w:p>
             <w:pPr>
+              <w:widowControl w:val="0"/>
               <w:jc w:val="left"/>
               <w:rPr>
                 <w:rFonts w:hint="default"/>
@@ -16276,6 +16316,7 @@
           </w:tcPr>
           <w:p>
             <w:pPr>
+              <w:widowControl w:val="0"/>
               <w:jc w:val="left"/>
               <w:rPr>
                 <w:rFonts w:hint="default"/>
@@ -16309,7 +16350,9 @@
             <w:insideV w:val="single" w:color="auto" w:sz="4" w:space="0"/>
           </w:tblBorders>
           <w:tblCellMar>
+            <w:top w:w="0" w:type="dxa"/>
             <w:left w:w="108" w:type="dxa"/>
+            <w:bottom w:w="0" w:type="dxa"/>
             <w:right w:w="108" w:type="dxa"/>
           </w:tblCellMar>
         </w:tblPrEx>
@@ -16323,6 +16366,7 @@
           </w:tcPr>
           <w:p>
             <w:pPr>
+              <w:widowControl w:val="0"/>
               <w:jc w:val="left"/>
               <w:rPr>
                 <w:rFonts w:hint="default"/>
@@ -16350,6 +16394,7 @@
           </w:tcPr>
           <w:p>
             <w:pPr>
+              <w:widowControl w:val="0"/>
               <w:numPr>
                 <w:ilvl w:val="0"/>
                 <w:numId w:val="24"/>
@@ -16381,6 +16426,7 @@
           </w:tcPr>
           <w:p>
             <w:pPr>
+              <w:widowControl w:val="0"/>
               <w:jc w:val="left"/>
               <w:rPr>
                 <w:rFonts w:hint="default"/>
@@ -16403,6 +16449,7 @@
           </w:p>
           <w:p>
             <w:pPr>
+              <w:widowControl w:val="0"/>
               <w:jc w:val="left"/>
               <w:rPr>
                 <w:rFonts w:hint="default"/>
@@ -16425,6 +16472,7 @@
           </w:p>
           <w:p>
             <w:pPr>
+              <w:widowControl w:val="0"/>
               <w:jc w:val="left"/>
               <w:rPr>
                 <w:rFonts w:hint="default"/>
@@ -16447,6 +16495,7 @@
           </w:p>
           <w:p>
             <w:pPr>
+              <w:widowControl w:val="0"/>
               <w:jc w:val="left"/>
               <w:rPr>
                 <w:rFonts w:hint="default"/>
@@ -16474,6 +16523,7 @@
           </w:tcPr>
           <w:p>
             <w:pPr>
+              <w:widowControl w:val="0"/>
               <w:jc w:val="left"/>
               <w:rPr>
                 <w:b w:val="0"/>
@@ -16504,7 +16554,9 @@
             <w:insideV w:val="single" w:color="auto" w:sz="4" w:space="0"/>
           </w:tblBorders>
           <w:tblCellMar>
+            <w:top w:w="0" w:type="dxa"/>
             <w:left w:w="108" w:type="dxa"/>
+            <w:bottom w:w="0" w:type="dxa"/>
             <w:right w:w="108" w:type="dxa"/>
           </w:tblCellMar>
         </w:tblPrEx>
@@ -16518,6 +16570,7 @@
           </w:tcPr>
           <w:p>
             <w:pPr>
+              <w:widowControl w:val="0"/>
               <w:jc w:val="left"/>
             </w:pPr>
           </w:p>
@@ -16528,6 +16581,7 @@
           </w:tcPr>
           <w:p>
             <w:pPr>
+              <w:widowControl w:val="0"/>
               <w:numPr>
                 <w:ilvl w:val="0"/>
                 <w:numId w:val="24"/>
@@ -16560,6 +16614,7 @@
           </w:tcPr>
           <w:p>
             <w:pPr>
+              <w:widowControl w:val="0"/>
               <w:spacing w:line="360" w:lineRule="auto"/>
               <w:jc w:val="left"/>
               <w:rPr>
@@ -16583,6 +16638,7 @@
           </w:p>
           <w:p>
             <w:pPr>
+              <w:widowControl w:val="0"/>
               <w:spacing w:line="360" w:lineRule="auto"/>
               <w:jc w:val="left"/>
               <w:rPr>
@@ -16606,6 +16662,7 @@
           </w:p>
           <w:p>
             <w:pPr>
+              <w:widowControl w:val="0"/>
               <w:spacing w:line="360" w:lineRule="auto"/>
               <w:jc w:val="left"/>
               <w:rPr>
@@ -16629,6 +16686,7 @@
           </w:p>
           <w:p>
             <w:pPr>
+              <w:widowControl w:val="0"/>
               <w:spacing w:line="360" w:lineRule="auto"/>
               <w:jc w:val="left"/>
               <w:rPr>
@@ -16657,6 +16715,7 @@
           </w:tcPr>
           <w:p>
             <w:pPr>
+              <w:widowControl w:val="0"/>
               <w:jc w:val="left"/>
               <w:rPr>
                 <w:b w:val="0"/>
@@ -16687,7 +16746,9 @@
             <w:insideV w:val="single" w:color="auto" w:sz="4" w:space="0"/>
           </w:tblBorders>
           <w:tblCellMar>
+            <w:top w:w="0" w:type="dxa"/>
             <w:left w:w="108" w:type="dxa"/>
+            <w:bottom w:w="0" w:type="dxa"/>
             <w:right w:w="108" w:type="dxa"/>
           </w:tblCellMar>
         </w:tblPrEx>
@@ -16701,6 +16762,7 @@
           </w:tcPr>
           <w:p>
             <w:pPr>
+              <w:widowControl w:val="0"/>
               <w:jc w:val="left"/>
               <w:rPr>
                 <w:b/>
@@ -16716,6 +16778,7 @@
           </w:tcPr>
           <w:p>
             <w:pPr>
+              <w:widowControl w:val="0"/>
               <w:numPr>
                 <w:ilvl w:val="0"/>
                 <w:numId w:val="24"/>
@@ -16748,6 +16811,7 @@
           </w:tcPr>
           <w:p>
             <w:pPr>
+              <w:widowControl w:val="0"/>
               <w:jc w:val="left"/>
               <w:rPr>
                 <w:rFonts w:hint="default"/>
@@ -16770,6 +16834,7 @@
           </w:p>
           <w:p>
             <w:pPr>
+              <w:widowControl w:val="0"/>
               <w:jc w:val="left"/>
               <w:rPr>
                 <w:rFonts w:hint="default"/>
@@ -16797,6 +16862,7 @@
           </w:tcPr>
           <w:p>
             <w:pPr>
+              <w:widowControl w:val="0"/>
               <w:jc w:val="left"/>
               <w:rPr>
                 <w:b w:val="0"/>
@@ -17045,9 +17111,9 @@
         </w:rPr>
         <w:fldChar w:fldCharType="end"/>
       </w:r>
-      <w:bookmarkStart w:id="143" w:name="_Toc23844"/>
-      <w:bookmarkStart w:id="144" w:name="_Toc10208"/>
-      <w:bookmarkStart w:id="145" w:name="_Toc16812"/>
+      <w:bookmarkStart w:id="143" w:name="_Toc16812"/>
+      <w:bookmarkStart w:id="144" w:name="_Toc23844"/>
+      <w:bookmarkStart w:id="145" w:name="_Toc10208"/>
       <w:r>
         <w:rPr>
           <w:rFonts w:hint="default" w:ascii="Times New Roman" w:hAnsi="Times New Roman" w:cs="Times New Roman"/>
@@ -17330,9 +17396,9 @@
         </w:rPr>
         <w:fldChar w:fldCharType="end"/>
       </w:r>
-      <w:bookmarkStart w:id="146" w:name="_Toc11460"/>
-      <w:bookmarkStart w:id="147" w:name="_Toc15619"/>
-      <w:bookmarkStart w:id="148" w:name="_Toc23363"/>
+      <w:bookmarkStart w:id="146" w:name="_Toc23363"/>
+      <w:bookmarkStart w:id="147" w:name="_Toc11460"/>
+      <w:bookmarkStart w:id="148" w:name="_Toc15619"/>
       <w:r>
         <w:rPr>
           <w:rFonts w:hint="default" w:ascii="Times New Roman" w:hAnsi="Times New Roman" w:cs="Times New Roman"/>
@@ -17355,8 +17421,8 @@
         <w:pStyle w:val="5"/>
         <w:bidi w:val="0"/>
       </w:pPr>
-      <w:bookmarkStart w:id="149" w:name="_Toc1977"/>
-      <w:bookmarkStart w:id="150" w:name="_Toc27405"/>
+      <w:bookmarkStart w:id="149" w:name="_Toc27405"/>
+      <w:bookmarkStart w:id="150" w:name="_Toc1977"/>
       <w:r>
         <w:rPr>
           <w:rFonts w:hint="default"/>
@@ -17996,9 +18062,9 @@
         </w:rPr>
         <w:fldChar w:fldCharType="end"/>
       </w:r>
-      <w:bookmarkStart w:id="151" w:name="_Toc17611"/>
-      <w:bookmarkStart w:id="152" w:name="_Toc10534"/>
-      <w:bookmarkStart w:id="153" w:name="_Toc8015"/>
+      <w:bookmarkStart w:id="151" w:name="_Toc8015"/>
+      <w:bookmarkStart w:id="152" w:name="_Toc17611"/>
+      <w:bookmarkStart w:id="153" w:name="_Toc10534"/>
       <w:r>
         <w:rPr>
           <w:rFonts w:hint="default" w:ascii="Times New Roman" w:hAnsi="Times New Roman" w:cs="Times New Roman"/>
@@ -18575,9 +18641,9 @@
         </w:rPr>
         <w:fldChar w:fldCharType="end"/>
       </w:r>
-      <w:bookmarkStart w:id="159" w:name="_Toc31513"/>
+      <w:bookmarkStart w:id="159" w:name="_Toc28697"/>
       <w:bookmarkStart w:id="160" w:name="_Toc13738"/>
-      <w:bookmarkStart w:id="161" w:name="_Toc28697"/>
+      <w:bookmarkStart w:id="161" w:name="_Toc31513"/>
       <w:r>
         <w:rPr>
           <w:rFonts w:hint="default" w:ascii="Times New Roman" w:hAnsi="Times New Roman" w:cs="Times New Roman"/>
@@ -18603,8 +18669,8 @@
           <w:rFonts w:ascii="Times New Roman" w:hAnsi="Times New Roman" w:cs="Times New Roman"/>
         </w:rPr>
       </w:pPr>
-      <w:bookmarkStart w:id="162" w:name="_Toc4636"/>
-      <w:bookmarkStart w:id="163" w:name="_Toc5566"/>
+      <w:bookmarkStart w:id="162" w:name="_Toc5566"/>
+      <w:bookmarkStart w:id="163" w:name="_Toc4636"/>
       <w:r>
         <w:rPr>
           <w:rFonts w:ascii="Times New Roman" w:hAnsi="Times New Roman" w:cs="Times New Roman"/>
@@ -18733,9 +18799,9 @@
         </w:rPr>
         <w:fldChar w:fldCharType="end"/>
       </w:r>
-      <w:bookmarkStart w:id="167" w:name="_Toc32231"/>
-      <w:bookmarkStart w:id="168" w:name="_Toc22935"/>
-      <w:bookmarkStart w:id="169" w:name="_Toc27326"/>
+      <w:bookmarkStart w:id="167" w:name="_Toc22935"/>
+      <w:bookmarkStart w:id="168" w:name="_Toc27326"/>
+      <w:bookmarkStart w:id="169" w:name="_Toc32231"/>
       <w:r>
         <w:rPr>
           <w:rFonts w:hint="default" w:ascii="Times New Roman" w:hAnsi="Times New Roman" w:cs="Times New Roman"/>
@@ -18775,8 +18841,8 @@
       <w:pPr>
         <w:pStyle w:val="3"/>
       </w:pPr>
-      <w:bookmarkStart w:id="170" w:name="_Toc27014"/>
-      <w:bookmarkStart w:id="171" w:name="_Toc26752"/>
+      <w:bookmarkStart w:id="170" w:name="_Toc26752"/>
+      <w:bookmarkStart w:id="171" w:name="_Toc27014"/>
       <w:r>
         <w:t>5.2 Routing Algorithms and Query Processing Workflow</w:t>
       </w:r>
@@ -18814,8 +18880,8 @@
       <w:pPr>
         <w:pStyle w:val="3"/>
       </w:pPr>
-      <w:bookmarkStart w:id="172" w:name="_Toc31641"/>
-      <w:bookmarkStart w:id="173" w:name="_Toc20525"/>
+      <w:bookmarkStart w:id="172" w:name="_Toc20525"/>
+      <w:bookmarkStart w:id="173" w:name="_Toc31641"/>
       <w:r>
         <w:t>5.3 System Implementation Technologies and Architecture</w:t>
       </w:r>
@@ -18867,8 +18933,8 @@
         <w:pStyle w:val="4"/>
         <w:jc w:val="left"/>
       </w:pPr>
-      <w:bookmarkStart w:id="176" w:name="_Toc13125"/>
-      <w:bookmarkStart w:id="177" w:name="_Toc6265"/>
+      <w:bookmarkStart w:id="176" w:name="_Toc6265"/>
+      <w:bookmarkStart w:id="177" w:name="_Toc13125"/>
       <w:r>
         <w:t>5.3.2 Hybrid AI Inference Strategy</w:t>
       </w:r>
@@ -19126,8 +19192,8 @@
         </w:rPr>
         <w:fldChar w:fldCharType="end"/>
       </w:r>
-      <w:bookmarkStart w:id="180" w:name="_Toc29412"/>
-      <w:bookmarkStart w:id="181" w:name="_Toc10175"/>
+      <w:bookmarkStart w:id="180" w:name="_Toc10175"/>
+      <w:bookmarkStart w:id="181" w:name="_Toc29412"/>
       <w:bookmarkStart w:id="182" w:name="_Toc9776"/>
       <w:r>
         <w:rPr>
@@ -19246,9 +19312,9 @@
         </w:rPr>
         <w:fldChar w:fldCharType="end"/>
       </w:r>
-      <w:bookmarkStart w:id="183" w:name="_Toc155"/>
-      <w:bookmarkStart w:id="184" w:name="_Toc1564"/>
-      <w:bookmarkStart w:id="185" w:name="_Toc27322"/>
+      <w:bookmarkStart w:id="183" w:name="_Toc27322"/>
+      <w:bookmarkStart w:id="184" w:name="_Toc155"/>
+      <w:bookmarkStart w:id="185" w:name="_Toc1564"/>
       <w:r>
         <w:rPr>
           <w:rFonts w:hint="default" w:ascii="Times New Roman" w:hAnsi="Times New Roman" w:cs="Times New Roman"/>
@@ -19283,8 +19349,8 @@
           <w:rFonts w:hint="default" w:ascii="Times New Roman" w:hAnsi="Times New Roman" w:cs="Times New Roman"/>
         </w:rPr>
       </w:pPr>
-      <w:bookmarkStart w:id="186" w:name="_Toc13155"/>
-      <w:bookmarkStart w:id="187" w:name="_Toc29873"/>
+      <w:bookmarkStart w:id="186" w:name="_Toc29873"/>
+      <w:bookmarkStart w:id="187" w:name="_Toc13155"/>
       <w:r>
         <w:rPr>
           <w:rFonts w:hint="default" w:ascii="Times New Roman" w:hAnsi="Times New Roman" w:cs="Times New Roman"/>
@@ -20227,19 +20293,19 @@
       </w:r>
       <w:bookmarkStart w:id="192" w:name="_Toc8854"/>
       <w:bookmarkStart w:id="193" w:name="_Toc8434"/>
-      <w:bookmarkStart w:id="194" w:name="_Toc18246"/>
-      <w:bookmarkStart w:id="195" w:name="_Toc4742"/>
-      <w:bookmarkStart w:id="196" w:name="_Toc32282"/>
-      <w:bookmarkStart w:id="197" w:name="_Toc14804"/>
-      <w:bookmarkStart w:id="198" w:name="_Toc2983"/>
-      <w:bookmarkStart w:id="199" w:name="_Toc22271"/>
-      <w:bookmarkStart w:id="200" w:name="_Toc11110"/>
-      <w:bookmarkStart w:id="201" w:name="_Toc4589"/>
-      <w:bookmarkStart w:id="202" w:name="_Toc22876"/>
-      <w:bookmarkStart w:id="203" w:name="_Toc4558"/>
-      <w:bookmarkStart w:id="204" w:name="_Toc32463"/>
-      <w:bookmarkStart w:id="205" w:name="_Toc2439"/>
-      <w:bookmarkStart w:id="206" w:name="_Toc11083"/>
+      <w:bookmarkStart w:id="194" w:name="_Toc11083"/>
+      <w:bookmarkStart w:id="195" w:name="_Toc22271"/>
+      <w:bookmarkStart w:id="196" w:name="_Toc14804"/>
+      <w:bookmarkStart w:id="197" w:name="_Toc32282"/>
+      <w:bookmarkStart w:id="198" w:name="_Toc4742"/>
+      <w:bookmarkStart w:id="199" w:name="_Toc11110"/>
+      <w:bookmarkStart w:id="200" w:name="_Toc22876"/>
+      <w:bookmarkStart w:id="201" w:name="_Toc18246"/>
+      <w:bookmarkStart w:id="202" w:name="_Toc2983"/>
+      <w:bookmarkStart w:id="203" w:name="_Toc4589"/>
+      <w:bookmarkStart w:id="204" w:name="_Toc4558"/>
+      <w:bookmarkStart w:id="205" w:name="_Toc32463"/>
+      <w:bookmarkStart w:id="206" w:name="_Toc2439"/>
       <w:r>
         <w:rPr>
           <w:rFonts w:hint="default" w:ascii="Times New Roman" w:hAnsi="Times New Roman" w:cs="Times New Roman"/>
@@ -21951,7 +22017,6 @@
             <w:insideH w:val="none" w:color="auto" w:sz="0" w:space="0"/>
             <w:insideV w:val="none" w:color="auto" w:sz="0" w:space="0"/>
           </w:tblBorders>
-          <w:shd w:val="clear" w:color="auto" w:fill="auto"/>
           <w:tblCellMar>
             <w:top w:w="0" w:type="dxa"/>
             <w:left w:w="0" w:type="dxa"/>
@@ -24523,7 +24588,6 @@
             <w:insideH w:val="none" w:color="auto" w:sz="0" w:space="0"/>
             <w:insideV w:val="none" w:color="auto" w:sz="0" w:space="0"/>
           </w:tblBorders>
-          <w:shd w:val="clear" w:color="auto" w:fill="auto"/>
           <w:tblCellMar>
             <w:top w:w="0" w:type="dxa"/>
             <w:left w:w="0" w:type="dxa"/>
@@ -24959,10 +25023,10 @@
       </w:r>
       <w:bookmarkStart w:id="207" w:name="_Toc5489"/>
       <w:bookmarkStart w:id="208" w:name="_Toc10281"/>
-      <w:bookmarkStart w:id="209" w:name="_Toc30323"/>
-      <w:bookmarkStart w:id="210" w:name="_Toc29139"/>
-      <w:bookmarkStart w:id="211" w:name="_Toc7645"/>
-      <w:bookmarkStart w:id="212" w:name="_Toc15135"/>
+      <w:bookmarkStart w:id="209" w:name="_Toc29139"/>
+      <w:bookmarkStart w:id="210" w:name="_Toc15135"/>
+      <w:bookmarkStart w:id="211" w:name="_Toc30323"/>
+      <w:bookmarkStart w:id="212" w:name="_Toc7645"/>
       <w:r>
         <w:rPr>
           <w:rFonts w:hint="default" w:cs="Times New Roman"/>
@@ -25379,6 +25443,7 @@
             <w:insideH w:val="none" w:color="auto" w:sz="0" w:space="0"/>
             <w:insideV w:val="none" w:color="auto" w:sz="0" w:space="0"/>
           </w:tblBorders>
+          <w:shd w:val="clear" w:color="auto" w:fill="auto"/>
           <w:tblCellMar>
             <w:top w:w="0" w:type="dxa"/>
             <w:left w:w="0" w:type="dxa"/>
@@ -25527,6 +25592,7 @@
             <w:insideH w:val="none" w:color="auto" w:sz="0" w:space="0"/>
             <w:insideV w:val="none" w:color="auto" w:sz="0" w:space="0"/>
           </w:tblBorders>
+          <w:shd w:val="clear" w:color="auto" w:fill="auto"/>
           <w:tblCellMar>
             <w:top w:w="0" w:type="dxa"/>
             <w:left w:w="0" w:type="dxa"/>
@@ -25675,7 +25741,6 @@
             <w:insideH w:val="none" w:color="auto" w:sz="0" w:space="0"/>
             <w:insideV w:val="none" w:color="auto" w:sz="0" w:space="0"/>
           </w:tblBorders>
-          <w:shd w:val="clear" w:color="auto" w:fill="auto"/>
           <w:tblCellMar>
             <w:top w:w="0" w:type="dxa"/>
             <w:left w:w="0" w:type="dxa"/>
@@ -26122,6 +26187,7 @@
             <w:insideH w:val="none" w:color="auto" w:sz="0" w:space="0"/>
             <w:insideV w:val="none" w:color="auto" w:sz="0" w:space="0"/>
           </w:tblBorders>
+          <w:shd w:val="clear" w:color="auto" w:fill="auto"/>
           <w:tblCellMar>
             <w:top w:w="0" w:type="dxa"/>
             <w:left w:w="0" w:type="dxa"/>
@@ -26270,7 +26336,6 @@
             <w:insideH w:val="none" w:color="auto" w:sz="0" w:space="0"/>
             <w:insideV w:val="none" w:color="auto" w:sz="0" w:space="0"/>
           </w:tblBorders>
-          <w:shd w:val="clear" w:color="auto" w:fill="auto"/>
           <w:tblCellMar>
             <w:top w:w="0" w:type="dxa"/>
             <w:left w:w="0" w:type="dxa"/>
@@ -26419,6 +26484,7 @@
             <w:insideH w:val="none" w:color="auto" w:sz="0" w:space="0"/>
             <w:insideV w:val="none" w:color="auto" w:sz="0" w:space="0"/>
           </w:tblBorders>
+          <w:shd w:val="clear" w:color="auto" w:fill="auto"/>
           <w:tblCellMar>
             <w:top w:w="0" w:type="dxa"/>
             <w:left w:w="0" w:type="dxa"/>
@@ -27353,7 +27419,6 @@
             <w:insideH w:val="none" w:color="auto" w:sz="0" w:space="0"/>
             <w:insideV w:val="none" w:color="auto" w:sz="0" w:space="0"/>
           </w:tblBorders>
-          <w:shd w:val="clear" w:color="auto" w:fill="auto"/>
           <w:tblCellMar>
             <w:top w:w="0" w:type="dxa"/>
             <w:left w:w="0" w:type="dxa"/>
@@ -27651,6 +27716,7 @@
             <w:insideH w:val="none" w:color="auto" w:sz="0" w:space="0"/>
             <w:insideV w:val="none" w:color="auto" w:sz="0" w:space="0"/>
           </w:tblBorders>
+          <w:shd w:val="clear" w:color="auto" w:fill="auto"/>
           <w:tblCellMar>
             <w:top w:w="0" w:type="dxa"/>
             <w:left w:w="0" w:type="dxa"/>
@@ -27799,7 +27865,6 @@
             <w:insideH w:val="none" w:color="auto" w:sz="0" w:space="0"/>
             <w:insideV w:val="none" w:color="auto" w:sz="0" w:space="0"/>
           </w:tblBorders>
-          <w:shd w:val="clear" w:color="auto" w:fill="auto"/>
           <w:tblCellMar>
             <w:top w:w="0" w:type="dxa"/>
             <w:left w:w="0" w:type="dxa"/>
@@ -29598,14 +29663,14 @@
         </w:rPr>
         <w:fldChar w:fldCharType="end"/>
       </w:r>
-      <w:bookmarkStart w:id="215" w:name="_Toc26296"/>
+      <w:bookmarkStart w:id="215" w:name="_Toc3746"/>
       <w:bookmarkEnd w:id="215"/>
-      <w:bookmarkStart w:id="216" w:name="_Toc20995"/>
+      <w:bookmarkStart w:id="216" w:name="_Toc26296"/>
       <w:bookmarkEnd w:id="216"/>
-      <w:bookmarkStart w:id="217" w:name="_Toc3746"/>
+      <w:bookmarkStart w:id="217" w:name="_Toc20995"/>
       <w:bookmarkEnd w:id="217"/>
-      <w:bookmarkStart w:id="218" w:name="_Toc18626"/>
-      <w:bookmarkStart w:id="219" w:name="_Toc9603"/>
+      <w:bookmarkStart w:id="218" w:name="_Toc9603"/>
+      <w:bookmarkStart w:id="219" w:name="_Toc18626"/>
       <w:bookmarkStart w:id="220" w:name="_Toc11423"/>
       <w:bookmarkStart w:id="221" w:name="_Toc12329"/>
       <w:r>
@@ -30009,6 +30074,7 @@
             <w:insideH w:val="none" w:color="auto" w:sz="0" w:space="0"/>
             <w:insideV w:val="none" w:color="auto" w:sz="0" w:space="0"/>
           </w:tblBorders>
+          <w:shd w:val="clear" w:color="auto" w:fill="auto"/>
           <w:tblCellMar>
             <w:top w:w="0" w:type="dxa"/>
             <w:left w:w="0" w:type="dxa"/>
@@ -30342,6 +30408,7 @@
             <w:insideH w:val="none" w:color="auto" w:sz="0" w:space="0"/>
             <w:insideV w:val="none" w:color="auto" w:sz="0" w:space="0"/>
           </w:tblBorders>
+          <w:shd w:val="clear" w:color="auto" w:fill="auto"/>
           <w:tblCellMar>
             <w:top w:w="0" w:type="dxa"/>
             <w:left w:w="0" w:type="dxa"/>
@@ -30675,6 +30742,7 @@
             <w:insideH w:val="none" w:color="auto" w:sz="0" w:space="0"/>
             <w:insideV w:val="none" w:color="auto" w:sz="0" w:space="0"/>
           </w:tblBorders>
+          <w:shd w:val="clear" w:color="auto" w:fill="auto"/>
           <w:tblCellMar>
             <w:top w:w="0" w:type="dxa"/>
             <w:left w:w="0" w:type="dxa"/>
@@ -30883,8 +30951,8 @@
       </w:r>
       <w:bookmarkStart w:id="222" w:name="_Toc29995"/>
       <w:bookmarkStart w:id="223" w:name="_Toc442"/>
-      <w:bookmarkStart w:id="224" w:name="_Toc14444"/>
-      <w:bookmarkStart w:id="225" w:name="_Toc3444"/>
+      <w:bookmarkStart w:id="224" w:name="_Toc3444"/>
+      <w:bookmarkStart w:id="225" w:name="_Toc14444"/>
       <w:r>
         <w:rPr>
           <w:rFonts w:hint="default"/>
@@ -31188,7 +31256,6 @@
             <w:insideH w:val="none" w:color="auto" w:sz="0" w:space="0"/>
             <w:insideV w:val="none" w:color="auto" w:sz="0" w:space="0"/>
           </w:tblBorders>
-          <w:shd w:val="clear" w:color="auto" w:fill="auto"/>
           <w:tblCellMar>
             <w:top w:w="0" w:type="dxa"/>
             <w:left w:w="0" w:type="dxa"/>
@@ -31308,7 +31375,6 @@
             <w:insideH w:val="none" w:color="auto" w:sz="0" w:space="0"/>
             <w:insideV w:val="none" w:color="auto" w:sz="0" w:space="0"/>
           </w:tblBorders>
-          <w:shd w:val="clear" w:color="auto" w:fill="auto"/>
           <w:tblCellMar>
             <w:top w:w="0" w:type="dxa"/>
             <w:left w:w="0" w:type="dxa"/>
@@ -31428,7 +31494,6 @@
             <w:insideH w:val="none" w:color="auto" w:sz="0" w:space="0"/>
             <w:insideV w:val="none" w:color="auto" w:sz="0" w:space="0"/>
           </w:tblBorders>
-          <w:shd w:val="clear" w:color="auto" w:fill="auto"/>
           <w:tblCellMar>
             <w:top w:w="0" w:type="dxa"/>
             <w:left w:w="0" w:type="dxa"/>
@@ -33397,10 +33462,10 @@
         </w:rPr>
         <w:t>6.</w:t>
       </w:r>
-      <w:bookmarkStart w:id="227" w:name="_Toc14467"/>
-      <w:bookmarkStart w:id="228" w:name="_Toc1071"/>
-      <w:bookmarkStart w:id="229" w:name="_Toc28935"/>
-      <w:bookmarkStart w:id="230" w:name="_Toc23824"/>
+      <w:bookmarkStart w:id="227" w:name="_Toc23824"/>
+      <w:bookmarkStart w:id="228" w:name="_Toc14467"/>
+      <w:bookmarkStart w:id="229" w:name="_Toc1071"/>
+      <w:bookmarkStart w:id="230" w:name="_Toc28935"/>
       <w:r>
         <w:rPr>
           <w:rFonts w:hint="default"/>
@@ -34301,7 +34366,6 @@
             <w:insideH w:val="none" w:color="auto" w:sz="0" w:space="0"/>
             <w:insideV w:val="none" w:color="auto" w:sz="0" w:space="0"/>
           </w:tblBorders>
-          <w:shd w:val="clear" w:color="auto" w:fill="auto"/>
           <w:tblCellMar>
             <w:top w:w="0" w:type="dxa"/>
             <w:left w:w="0" w:type="dxa"/>
@@ -34542,7 +34606,6 @@
             <w:insideH w:val="none" w:color="auto" w:sz="0" w:space="0"/>
             <w:insideV w:val="none" w:color="auto" w:sz="0" w:space="0"/>
           </w:tblBorders>
-          <w:shd w:val="clear" w:color="auto" w:fill="auto"/>
           <w:tblCellMar>
             <w:top w:w="0" w:type="dxa"/>
             <w:left w:w="0" w:type="dxa"/>
@@ -36936,10 +36999,10 @@
         </w:rPr>
         <w:t xml:space="preserve">Table </w:t>
       </w:r>
-      <w:bookmarkStart w:id="232" w:name="_Toc4784"/>
-      <w:bookmarkStart w:id="233" w:name="_Toc107"/>
-      <w:bookmarkStart w:id="234" w:name="_Toc20634"/>
-      <w:bookmarkStart w:id="235" w:name="_Toc32233"/>
+      <w:bookmarkStart w:id="232" w:name="_Toc107"/>
+      <w:bookmarkStart w:id="233" w:name="_Toc20634"/>
+      <w:bookmarkStart w:id="234" w:name="_Toc32233"/>
+      <w:bookmarkStart w:id="235" w:name="_Toc4784"/>
       <w:r>
         <w:rPr>
           <w:rFonts w:hint="default"/>
@@ -37379,7 +37442,6 @@
             <w:insideH w:val="none" w:color="auto" w:sz="0" w:space="0"/>
             <w:insideV w:val="none" w:color="auto" w:sz="0" w:space="0"/>
           </w:tblBorders>
-          <w:shd w:val="clear" w:color="auto" w:fill="auto"/>
           <w:tblCellMar>
             <w:top w:w="0" w:type="dxa"/>
             <w:left w:w="0" w:type="dxa"/>
@@ -37547,7 +37609,6 @@
             <w:insideH w:val="none" w:color="auto" w:sz="0" w:space="0"/>
             <w:insideV w:val="none" w:color="auto" w:sz="0" w:space="0"/>
           </w:tblBorders>
-          <w:shd w:val="clear" w:color="auto" w:fill="auto"/>
           <w:tblCellMar>
             <w:top w:w="0" w:type="dxa"/>
             <w:left w:w="0" w:type="dxa"/>
@@ -37905,7 +37966,6 @@
             <w:insideH w:val="none" w:color="auto" w:sz="0" w:space="0"/>
             <w:insideV w:val="none" w:color="auto" w:sz="0" w:space="0"/>
           </w:tblBorders>
-          <w:shd w:val="clear" w:color="auto" w:fill="auto"/>
           <w:tblCellMar>
             <w:top w:w="0" w:type="dxa"/>
             <w:left w:w="0" w:type="dxa"/>
@@ -38241,7 +38301,6 @@
             <w:insideH w:val="none" w:color="auto" w:sz="0" w:space="0"/>
             <w:insideV w:val="none" w:color="auto" w:sz="0" w:space="0"/>
           </w:tblBorders>
-          <w:shd w:val="clear" w:color="auto" w:fill="auto"/>
           <w:tblCellMar>
             <w:top w:w="0" w:type="dxa"/>
             <w:left w:w="0" w:type="dxa"/>
@@ -38409,7 +38468,6 @@
             <w:insideH w:val="none" w:color="auto" w:sz="0" w:space="0"/>
             <w:insideV w:val="none" w:color="auto" w:sz="0" w:space="0"/>
           </w:tblBorders>
-          <w:shd w:val="clear" w:color="auto" w:fill="auto"/>
           <w:tblCellMar>
             <w:top w:w="0" w:type="dxa"/>
             <w:left w:w="0" w:type="dxa"/>
@@ -39108,10 +39166,10 @@
         </w:rPr>
         <w:t>6.</w:t>
       </w:r>
-      <w:bookmarkStart w:id="238" w:name="_Toc9392"/>
-      <w:bookmarkStart w:id="239" w:name="_Toc3186"/>
-      <w:bookmarkStart w:id="240" w:name="_Toc5393"/>
-      <w:bookmarkStart w:id="241" w:name="_Toc3387"/>
+      <w:bookmarkStart w:id="238" w:name="_Toc3387"/>
+      <w:bookmarkStart w:id="239" w:name="_Toc5393"/>
+      <w:bookmarkStart w:id="240" w:name="_Toc3186"/>
+      <w:bookmarkStart w:id="241" w:name="_Toc9392"/>
       <w:r>
         <w:rPr>
           <w:rFonts w:hint="default"/>
@@ -39166,7 +39224,6 @@
             <w:insideH w:val="none" w:color="auto" w:sz="0" w:space="0"/>
             <w:insideV w:val="none" w:color="auto" w:sz="0" w:space="0"/>
           </w:tblBorders>
-          <w:shd w:val="clear" w:color="auto" w:fill="auto"/>
           <w:tblCellMar>
             <w:top w:w="0" w:type="dxa"/>
             <w:left w:w="0" w:type="dxa"/>
@@ -39743,7 +39800,6 @@
             <w:insideH w:val="none" w:color="auto" w:sz="0" w:space="0"/>
             <w:insideV w:val="none" w:color="auto" w:sz="0" w:space="0"/>
           </w:tblBorders>
-          <w:shd w:val="clear" w:color="auto" w:fill="auto"/>
           <w:tblCellMar>
             <w:top w:w="0" w:type="dxa"/>
             <w:left w:w="0" w:type="dxa"/>
@@ -39972,7 +40028,6 @@
             <w:insideH w:val="none" w:color="auto" w:sz="0" w:space="0"/>
             <w:insideV w:val="none" w:color="auto" w:sz="0" w:space="0"/>
           </w:tblBorders>
-          <w:shd w:val="clear" w:color="auto" w:fill="auto"/>
           <w:tblCellMar>
             <w:top w:w="0" w:type="dxa"/>
             <w:left w:w="0" w:type="dxa"/>
@@ -40957,9 +41012,9 @@
         </w:rPr>
         <w:t>6.</w:t>
       </w:r>
-      <w:bookmarkStart w:id="245" w:name="_Toc29425"/>
-      <w:bookmarkStart w:id="246" w:name="_Toc19075"/>
-      <w:bookmarkStart w:id="247" w:name="_Toc8830"/>
+      <w:bookmarkStart w:id="245" w:name="_Toc19075"/>
+      <w:bookmarkStart w:id="246" w:name="_Toc8830"/>
+      <w:bookmarkStart w:id="247" w:name="_Toc29425"/>
       <w:bookmarkStart w:id="248" w:name="_Toc12462"/>
       <w:r>
         <w:rPr>
@@ -42549,8 +42604,8 @@
       </w:r>
       <w:bookmarkStart w:id="251" w:name="_Toc29554"/>
       <w:bookmarkStart w:id="252" w:name="_Toc3550"/>
-      <w:bookmarkStart w:id="253" w:name="_Toc20867"/>
-      <w:bookmarkStart w:id="254" w:name="_Toc28265"/>
+      <w:bookmarkStart w:id="253" w:name="_Toc28265"/>
+      <w:bookmarkStart w:id="254" w:name="_Toc20867"/>
       <w:r>
         <w:rPr>
           <w:rFonts w:hint="default"/>
@@ -43562,7 +43617,6 @@
             <w:insideH w:val="none" w:color="auto" w:sz="0" w:space="0"/>
             <w:insideV w:val="none" w:color="auto" w:sz="0" w:space="0"/>
           </w:tblBorders>
-          <w:shd w:val="clear" w:color="auto" w:fill="auto"/>
           <w:tblCellMar>
             <w:top w:w="0" w:type="dxa"/>
             <w:left w:w="0" w:type="dxa"/>
@@ -43984,14 +44038,2551 @@
           <w:lang w:val="en-US"/>
         </w:rPr>
       </w:pPr>
-      <w:r>
-        <w:rPr>
-          <w:rFonts w:hint="default" w:ascii="Times New Roman" w:hAnsi="Times New Roman" w:eastAsia="sans-serif" w:cs="Times New Roman"/>
-          <w:sz w:val="26"/>
-          <w:szCs w:val="26"/>
+    </w:p>
+    <w:p>
+      <w:pPr>
+        <w:pStyle w:val="3"/>
+        <w:bidi w:val="0"/>
+        <w:rPr>
+          <w:rFonts w:hint="default"/>
+        </w:rPr>
+      </w:pPr>
+      <w:r>
+        <w:rPr>
+          <w:rFonts w:hint="default"/>
+        </w:rPr>
+        <w:t>6.</w:t>
+      </w:r>
+      <w:r>
+        <w:rPr>
+          <w:rFonts w:hint="default"/>
           <w:lang w:val="en-US"/>
         </w:rPr>
-        <w:br w:type="page"/>
+        <w:t>4</w:t>
+      </w:r>
+      <w:r>
+        <w:rPr>
+          <w:rFonts w:hint="default"/>
+        </w:rPr>
+        <w:t>. Stability Evaluation (Endurance Stress Test)</w:t>
+      </w:r>
+    </w:p>
+    <w:p>
+      <w:pPr>
+        <w:pStyle w:val="15"/>
+        <w:keepNext w:val="0"/>
+        <w:keepLines w:val="0"/>
+        <w:widowControl/>
+        <w:suppressLineNumbers w:val="0"/>
+        <w:spacing w:beforeAutospacing="1"/>
+        <w:rPr>
+          <w:sz w:val="26"/>
+          <w:szCs w:val="26"/>
+        </w:rPr>
+      </w:pPr>
+      <w:r>
+        <w:rPr>
+          <w:sz w:val="26"/>
+          <w:szCs w:val="26"/>
+        </w:rPr>
+        <w:t>To rigorously validate the operational resilience of the proposed architecture, a continuous 24-hour soak test was executed on the Edge Node (Acer Nitro 5). The experiment aimed to identify the system's breaking point, monitor resource behavior under prolonged workload conditions, and distinguish between internal software faults and external service limitations.</w:t>
+      </w:r>
+    </w:p>
+    <w:p>
+      <w:pPr>
+        <w:pStyle w:val="4"/>
+        <w:keepNext w:val="0"/>
+        <w:keepLines w:val="0"/>
+        <w:widowControl/>
+        <w:suppressLineNumbers w:val="0"/>
+        <w:rPr>
+          <w:sz w:val="26"/>
+          <w:szCs w:val="26"/>
+        </w:rPr>
+      </w:pPr>
+      <w:r>
+        <w:rPr>
+          <w:sz w:val="26"/>
+          <w:szCs w:val="26"/>
+        </w:rPr>
+        <w:t>6.4.1. Experimental Methodology</w:t>
+      </w:r>
+    </w:p>
+    <w:p>
+      <w:pPr>
+        <w:pStyle w:val="15"/>
+        <w:keepNext w:val="0"/>
+        <w:keepLines w:val="0"/>
+        <w:widowControl/>
+        <w:suppressLineNumbers w:val="0"/>
+        <w:spacing w:beforeAutospacing="1"/>
+        <w:rPr>
+          <w:sz w:val="26"/>
+          <w:szCs w:val="26"/>
+        </w:rPr>
+      </w:pPr>
+      <w:r>
+        <w:rPr>
+          <w:sz w:val="26"/>
+          <w:szCs w:val="26"/>
+        </w:rPr>
+        <w:t xml:space="preserve">The stress test was conducted continuously from </w:t>
+      </w:r>
+      <w:r>
+        <w:rPr>
+          <w:b/>
+          <w:bCs/>
+          <w:sz w:val="26"/>
+          <w:szCs w:val="26"/>
+        </w:rPr>
+        <w:t>21:28:51 (January 13)</w:t>
+      </w:r>
+      <w:r>
+        <w:rPr>
+          <w:sz w:val="26"/>
+          <w:szCs w:val="26"/>
+        </w:rPr>
+        <w:t xml:space="preserve"> to </w:t>
+      </w:r>
+      <w:r>
+        <w:rPr>
+          <w:b/>
+          <w:bCs/>
+          <w:sz w:val="26"/>
+          <w:szCs w:val="26"/>
+        </w:rPr>
+        <w:t>21:28:26 (January 14)</w:t>
+      </w:r>
+      <w:r>
+        <w:rPr>
+          <w:sz w:val="26"/>
+          <w:szCs w:val="26"/>
+        </w:rPr>
+        <w:t>, encompassing a full diurnal cycle to simulate real-world deployment scenarios.</w:t>
+      </w:r>
+    </w:p>
+    <w:p>
+      <w:pPr>
+        <w:pStyle w:val="15"/>
+        <w:keepNext w:val="0"/>
+        <w:keepLines w:val="0"/>
+        <w:widowControl/>
+        <w:suppressLineNumbers w:val="0"/>
+        <w:spacing w:beforeAutospacing="1"/>
+        <w:ind w:left="720"/>
+        <w:rPr>
+          <w:sz w:val="26"/>
+          <w:szCs w:val="26"/>
+        </w:rPr>
+      </w:pPr>
+      <w:r>
+        <w:rPr>
+          <w:b/>
+          <w:bCs/>
+          <w:sz w:val="26"/>
+          <w:szCs w:val="26"/>
+        </w:rPr>
+        <w:t>Test Environment:</w:t>
+      </w:r>
+      <w:r>
+        <w:rPr>
+          <w:sz w:val="26"/>
+          <w:szCs w:val="26"/>
+        </w:rPr>
+        <w:t xml:space="preserve"> On-premise Edge Server (Acer Nitro 5, Ryzen 5, 16GB RAM).</w:t>
+      </w:r>
+    </w:p>
+    <w:p>
+      <w:pPr>
+        <w:pStyle w:val="15"/>
+        <w:keepNext w:val="0"/>
+        <w:keepLines w:val="0"/>
+        <w:widowControl/>
+        <w:suppressLineNumbers w:val="0"/>
+        <w:spacing w:beforeAutospacing="1"/>
+        <w:ind w:left="720"/>
+        <w:rPr>
+          <w:sz w:val="26"/>
+          <w:szCs w:val="26"/>
+        </w:rPr>
+      </w:pPr>
+      <w:r>
+        <w:rPr>
+          <w:b/>
+          <w:bCs/>
+          <w:sz w:val="26"/>
+          <w:szCs w:val="26"/>
+        </w:rPr>
+        <w:t>Workload Generator:</w:t>
+      </w:r>
+      <w:r>
+        <w:rPr>
+          <w:sz w:val="26"/>
+          <w:szCs w:val="26"/>
+        </w:rPr>
+        <w:t xml:space="preserve"> Automated Python agent dispatching randomized queries (Transport, Tourism, Safety) at a frequency of 60 seconds.</w:t>
+      </w:r>
+    </w:p>
+    <w:p>
+      <w:pPr>
+        <w:pStyle w:val="15"/>
+        <w:keepNext w:val="0"/>
+        <w:keepLines w:val="0"/>
+        <w:widowControl/>
+        <w:suppressLineNumbers w:val="0"/>
+        <w:spacing w:beforeAutospacing="1"/>
+        <w:ind w:left="720"/>
+        <w:rPr>
+          <w:sz w:val="26"/>
+          <w:szCs w:val="26"/>
+        </w:rPr>
+      </w:pPr>
+      <w:r>
+        <w:rPr>
+          <w:b/>
+          <w:bCs/>
+          <w:sz w:val="26"/>
+          <w:szCs w:val="26"/>
+        </w:rPr>
+        <w:t>Monitoring Metrics:</w:t>
+      </w:r>
+      <w:r>
+        <w:rPr>
+          <w:sz w:val="26"/>
+          <w:szCs w:val="26"/>
+        </w:rPr>
+        <w:t xml:space="preserve"> End-to-end Latency, Memory Footprint (RAM), CPU Load, and HTTP Status Codes.</w:t>
+      </w:r>
+    </w:p>
+    <w:p>
+      <w:pPr>
+        <w:pStyle w:val="15"/>
+        <w:keepNext w:val="0"/>
+        <w:keepLines w:val="0"/>
+        <w:widowControl/>
+        <w:suppressLineNumbers w:val="0"/>
+        <w:spacing w:beforeAutospacing="1"/>
+        <w:ind w:left="720"/>
+        <w:rPr>
+          <w:sz w:val="26"/>
+          <w:szCs w:val="26"/>
+        </w:rPr>
+      </w:pPr>
+      <w:r>
+        <w:rPr>
+          <w:b/>
+          <w:bCs/>
+          <w:sz w:val="26"/>
+          <w:szCs w:val="26"/>
+        </w:rPr>
+        <w:t>Success Criteria:</w:t>
+      </w:r>
+      <w:r>
+        <w:rPr>
+          <w:sz w:val="26"/>
+          <w:szCs w:val="26"/>
+        </w:rPr>
+        <w:t xml:space="preserve"> System uptime &gt; 8 hours without process termination; Stable memory usage (no leaks); API availability.</w:t>
+      </w:r>
+    </w:p>
+    <w:p>
+      <w:pPr>
+        <w:pStyle w:val="4"/>
+        <w:keepNext w:val="0"/>
+        <w:keepLines w:val="0"/>
+        <w:widowControl/>
+        <w:suppressLineNumbers w:val="0"/>
+        <w:rPr>
+          <w:sz w:val="26"/>
+          <w:szCs w:val="26"/>
+        </w:rPr>
+      </w:pPr>
+      <w:r>
+        <w:rPr>
+          <w:sz w:val="26"/>
+          <w:szCs w:val="26"/>
+        </w:rPr>
+        <w:t>6.4.2. Quantitative Results &amp; Phase Analysis</w:t>
+      </w:r>
+    </w:p>
+    <w:p>
+      <w:pPr>
+        <w:pStyle w:val="15"/>
+        <w:keepNext w:val="0"/>
+        <w:keepLines w:val="0"/>
+        <w:widowControl/>
+        <w:suppressLineNumbers w:val="0"/>
+        <w:spacing w:beforeAutospacing="1"/>
+        <w:rPr>
+          <w:sz w:val="26"/>
+          <w:szCs w:val="26"/>
+        </w:rPr>
+      </w:pPr>
+      <w:r>
+        <w:rPr>
+          <w:sz w:val="26"/>
+          <w:szCs w:val="26"/>
+        </w:rPr>
+        <w:t xml:space="preserve">Telemetry data collected throughout the session reveals two distinct operational phases, separated by a critical inflection point at </w:t>
+      </w:r>
+      <w:r>
+        <w:rPr>
+          <w:b/>
+          <w:bCs/>
+          <w:sz w:val="26"/>
+          <w:szCs w:val="26"/>
+        </w:rPr>
+        <w:t>09:24 AM</w:t>
+      </w:r>
+      <w:r>
+        <w:rPr>
+          <w:sz w:val="26"/>
+          <w:szCs w:val="26"/>
+        </w:rPr>
+        <w:t>. The quantitative performance metrics are analyzed below:</w:t>
+      </w:r>
+    </w:p>
+    <w:p>
+      <w:pPr>
+        <w:bidi w:val="0"/>
+        <w:rPr>
+          <w:rFonts w:hint="default" w:ascii="Times New Roman" w:hAnsi="Times New Roman" w:eastAsia="SimSun" w:cs="Times New Roman"/>
+          <w:sz w:val="26"/>
+          <w:szCs w:val="26"/>
+        </w:rPr>
+      </w:pPr>
+      <w:r>
+        <w:rPr>
+          <w:rFonts w:hint="default" w:ascii="Times New Roman" w:hAnsi="Times New Roman" w:eastAsia="SimSun" w:cs="Times New Roman"/>
+          <w:sz w:val="26"/>
+          <w:szCs w:val="26"/>
+        </w:rPr>
+        <w:t>Table 6.</w:t>
+      </w:r>
+      <w:r>
+        <w:rPr>
+          <w:rFonts w:hint="default" w:ascii="Times New Roman" w:hAnsi="Times New Roman" w:cs="Times New Roman"/>
+          <w:sz w:val="26"/>
+          <w:szCs w:val="26"/>
+          <w:lang w:val="en-US"/>
+        </w:rPr>
+        <w:t>10</w:t>
+      </w:r>
+      <w:r>
+        <w:rPr>
+          <w:rFonts w:hint="default" w:ascii="Times New Roman" w:hAnsi="Times New Roman" w:eastAsia="SimSun" w:cs="Times New Roman"/>
+          <w:sz w:val="26"/>
+          <w:szCs w:val="26"/>
+        </w:rPr>
+        <w:t>. Stability Test Summary Statistics</w:t>
+      </w:r>
+    </w:p>
+    <w:tbl>
+      <w:tblPr>
+        <w:tblW w:w="0" w:type="auto"/>
+        <w:tblCellSpacing w:w="15" w:type="dxa"/>
+        <w:tblInd w:w="224" w:type="dxa"/>
+        <w:tblBorders>
+          <w:top w:val="none" w:color="1F1F1F" w:sz="0" w:space="0"/>
+          <w:left w:val="none" w:color="1F1F1F" w:sz="0" w:space="0"/>
+          <w:bottom w:val="none" w:color="1F1F1F" w:sz="0" w:space="0"/>
+          <w:right w:val="none" w:color="1F1F1F" w:sz="0" w:space="0"/>
+          <w:insideH w:val="none" w:color="auto" w:sz="0" w:space="0"/>
+          <w:insideV w:val="none" w:color="auto" w:sz="0" w:space="0"/>
+        </w:tblBorders>
+        <w:shd w:val="clear"/>
+        <w:tblLayout w:type="autofit"/>
+        <w:tblCellMar>
+          <w:top w:w="0" w:type="dxa"/>
+          <w:left w:w="0" w:type="dxa"/>
+          <w:bottom w:w="0" w:type="dxa"/>
+          <w:right w:w="0" w:type="dxa"/>
+        </w:tblCellMar>
+      </w:tblPr>
+      <w:tblGrid>
+        <w:gridCol w:w="1793"/>
+        <w:gridCol w:w="3472"/>
+        <w:gridCol w:w="3972"/>
+      </w:tblGrid>
+      <w:tr>
+        <w:tblPrEx>
+          <w:tblBorders>
+            <w:top w:val="none" w:color="1F1F1F" w:sz="0" w:space="0"/>
+            <w:left w:val="none" w:color="1F1F1F" w:sz="0" w:space="0"/>
+            <w:bottom w:val="none" w:color="1F1F1F" w:sz="0" w:space="0"/>
+            <w:right w:val="none" w:color="1F1F1F" w:sz="0" w:space="0"/>
+            <w:insideH w:val="none" w:color="auto" w:sz="0" w:space="0"/>
+            <w:insideV w:val="none" w:color="auto" w:sz="0" w:space="0"/>
+          </w:tblBorders>
+          <w:shd w:val="clear"/>
+          <w:tblCellMar>
+            <w:top w:w="0" w:type="dxa"/>
+            <w:left w:w="0" w:type="dxa"/>
+            <w:bottom w:w="0" w:type="dxa"/>
+            <w:right w:w="0" w:type="dxa"/>
+          </w:tblCellMar>
+        </w:tblPrEx>
+        <w:trPr>
+          <w:tblHeader/>
+          <w:tblCellSpacing w:w="15" w:type="dxa"/>
+        </w:trPr>
+        <w:tc>
+          <w:tcPr>
+            <w:tcW w:w="1748" w:type="dxa"/>
+            <w:tcBorders>
+              <w:top w:val="single" w:color="auto" w:sz="4" w:space="0"/>
+              <w:left w:val="single" w:color="auto" w:sz="4" w:space="0"/>
+              <w:bottom w:val="single" w:color="auto" w:sz="4" w:space="0"/>
+              <w:right w:val="single" w:color="auto" w:sz="4" w:space="0"/>
+            </w:tcBorders>
+            <w:shd w:val="clear"/>
+            <w:tcMar>
+              <w:top w:w="96" w:type="dxa"/>
+              <w:left w:w="144" w:type="dxa"/>
+              <w:bottom w:w="96" w:type="dxa"/>
+              <w:right w:w="144" w:type="dxa"/>
+            </w:tcMar>
+            <w:vAlign w:val="center"/>
+          </w:tcPr>
+          <w:p>
+            <w:pPr>
+              <w:keepNext w:val="0"/>
+              <w:keepLines w:val="0"/>
+              <w:widowControl/>
+              <w:suppressLineNumbers w:val="0"/>
+              <w:bidi w:val="0"/>
+              <w:spacing w:before="0" w:beforeAutospacing="0" w:after="0" w:afterAutospacing="0" w:line="12" w:lineRule="atLeast"/>
+              <w:ind w:left="0" w:right="0"/>
+              <w:jc w:val="left"/>
+              <w:rPr>
+                <w:rFonts w:hint="default" w:ascii="Times New Roman" w:hAnsi="Times New Roman" w:eastAsia="sans-serif" w:cs="Times New Roman"/>
+                <w:strike w:val="0"/>
+                <w:dstrike w:val="0"/>
+                <w:color w:val="1F1F1F"/>
+                <w:sz w:val="26"/>
+                <w:szCs w:val="26"/>
+              </w:rPr>
+            </w:pPr>
+            <w:r>
+              <w:rPr>
+                <w:rStyle w:val="16"/>
+                <w:rFonts w:hint="default" w:ascii="Times New Roman" w:hAnsi="Times New Roman" w:eastAsia="sans-serif" w:cs="Times New Roman"/>
+                <w:strike w:val="0"/>
+                <w:dstrike w:val="0"/>
+                <w:color w:val="1F1F1F"/>
+                <w:kern w:val="0"/>
+                <w:sz w:val="26"/>
+                <w:szCs w:val="26"/>
+                <w:bdr w:val="none" w:color="1F1F1F" w:sz="0" w:space="0"/>
+                <w:lang w:val="en-US" w:eastAsia="zh-CN" w:bidi="ar"/>
+              </w:rPr>
+              <w:t>Metric</w:t>
+            </w:r>
+          </w:p>
+        </w:tc>
+        <w:tc>
+          <w:tcPr>
+            <w:tcW w:w="0" w:type="auto"/>
+            <w:tcBorders>
+              <w:top w:val="single" w:color="auto" w:sz="4" w:space="0"/>
+              <w:left w:val="single" w:color="auto" w:sz="4" w:space="0"/>
+              <w:bottom w:val="single" w:color="auto" w:sz="4" w:space="0"/>
+              <w:right w:val="single" w:color="auto" w:sz="4" w:space="0"/>
+            </w:tcBorders>
+            <w:shd w:val="clear"/>
+            <w:tcMar>
+              <w:top w:w="96" w:type="dxa"/>
+              <w:left w:w="144" w:type="dxa"/>
+              <w:bottom w:w="96" w:type="dxa"/>
+              <w:right w:w="144" w:type="dxa"/>
+            </w:tcMar>
+            <w:vAlign w:val="center"/>
+          </w:tcPr>
+          <w:p>
+            <w:pPr>
+              <w:keepNext w:val="0"/>
+              <w:keepLines w:val="0"/>
+              <w:widowControl/>
+              <w:suppressLineNumbers w:val="0"/>
+              <w:bidi w:val="0"/>
+              <w:spacing w:before="0" w:beforeAutospacing="0" w:after="0" w:afterAutospacing="0" w:line="12" w:lineRule="atLeast"/>
+              <w:ind w:left="0" w:right="0"/>
+              <w:jc w:val="left"/>
+              <w:rPr>
+                <w:rFonts w:hint="default" w:ascii="Times New Roman" w:hAnsi="Times New Roman" w:eastAsia="sans-serif" w:cs="Times New Roman"/>
+                <w:strike w:val="0"/>
+                <w:dstrike w:val="0"/>
+                <w:color w:val="1F1F1F"/>
+                <w:sz w:val="26"/>
+                <w:szCs w:val="26"/>
+              </w:rPr>
+            </w:pPr>
+            <w:r>
+              <w:rPr>
+                <w:rStyle w:val="16"/>
+                <w:rFonts w:hint="default" w:ascii="Times New Roman" w:hAnsi="Times New Roman" w:eastAsia="sans-serif" w:cs="Times New Roman"/>
+                <w:strike w:val="0"/>
+                <w:dstrike w:val="0"/>
+                <w:color w:val="1F1F1F"/>
+                <w:kern w:val="0"/>
+                <w:sz w:val="26"/>
+                <w:szCs w:val="26"/>
+                <w:bdr w:val="none" w:color="1F1F1F" w:sz="0" w:space="0"/>
+                <w:lang w:val="en-US" w:eastAsia="zh-CN" w:bidi="ar"/>
+              </w:rPr>
+              <w:t>Phase 1: Stable Operation</w:t>
+            </w:r>
+          </w:p>
+        </w:tc>
+        <w:tc>
+          <w:tcPr>
+            <w:tcW w:w="3927" w:type="dxa"/>
+            <w:tcBorders>
+              <w:top w:val="single" w:color="auto" w:sz="4" w:space="0"/>
+              <w:left w:val="single" w:color="auto" w:sz="4" w:space="0"/>
+              <w:bottom w:val="single" w:color="auto" w:sz="4" w:space="0"/>
+              <w:right w:val="single" w:color="auto" w:sz="4" w:space="0"/>
+            </w:tcBorders>
+            <w:shd w:val="clear"/>
+            <w:tcMar>
+              <w:top w:w="96" w:type="dxa"/>
+              <w:left w:w="144" w:type="dxa"/>
+              <w:bottom w:w="96" w:type="dxa"/>
+              <w:right w:w="144" w:type="dxa"/>
+            </w:tcMar>
+            <w:vAlign w:val="center"/>
+          </w:tcPr>
+          <w:p>
+            <w:pPr>
+              <w:keepNext w:val="0"/>
+              <w:keepLines w:val="0"/>
+              <w:widowControl/>
+              <w:suppressLineNumbers w:val="0"/>
+              <w:bidi w:val="0"/>
+              <w:spacing w:before="0" w:beforeAutospacing="0" w:after="0" w:afterAutospacing="0" w:line="12" w:lineRule="atLeast"/>
+              <w:ind w:left="0" w:right="0"/>
+              <w:jc w:val="left"/>
+              <w:rPr>
+                <w:rFonts w:hint="default" w:ascii="Times New Roman" w:hAnsi="Times New Roman" w:eastAsia="sans-serif" w:cs="Times New Roman"/>
+                <w:strike w:val="0"/>
+                <w:dstrike w:val="0"/>
+                <w:color w:val="1F1F1F"/>
+                <w:sz w:val="26"/>
+                <w:szCs w:val="26"/>
+              </w:rPr>
+            </w:pPr>
+            <w:r>
+              <w:rPr>
+                <w:rStyle w:val="16"/>
+                <w:rFonts w:hint="default" w:ascii="Times New Roman" w:hAnsi="Times New Roman" w:eastAsia="sans-serif" w:cs="Times New Roman"/>
+                <w:strike w:val="0"/>
+                <w:dstrike w:val="0"/>
+                <w:color w:val="1F1F1F"/>
+                <w:kern w:val="0"/>
+                <w:sz w:val="26"/>
+                <w:szCs w:val="26"/>
+                <w:bdr w:val="none" w:color="1F1F1F" w:sz="0" w:space="0"/>
+                <w:lang w:val="en-US" w:eastAsia="zh-CN" w:bidi="ar"/>
+              </w:rPr>
+              <w:t>Phase 2: Service Saturation</w:t>
+            </w:r>
+          </w:p>
+        </w:tc>
+      </w:tr>
+      <w:tr>
+        <w:tblPrEx>
+          <w:tblBorders>
+            <w:top w:val="none" w:color="1F1F1F" w:sz="0" w:space="0"/>
+            <w:left w:val="none" w:color="1F1F1F" w:sz="0" w:space="0"/>
+            <w:bottom w:val="none" w:color="1F1F1F" w:sz="0" w:space="0"/>
+            <w:right w:val="none" w:color="1F1F1F" w:sz="0" w:space="0"/>
+            <w:insideH w:val="none" w:color="auto" w:sz="0" w:space="0"/>
+            <w:insideV w:val="none" w:color="auto" w:sz="0" w:space="0"/>
+          </w:tblBorders>
+          <w:shd w:val="clear"/>
+          <w:tblCellMar>
+            <w:top w:w="0" w:type="dxa"/>
+            <w:left w:w="0" w:type="dxa"/>
+            <w:bottom w:w="0" w:type="dxa"/>
+            <w:right w:w="0" w:type="dxa"/>
+          </w:tblCellMar>
+        </w:tblPrEx>
+        <w:trPr>
+          <w:tblCellSpacing w:w="15" w:type="dxa"/>
+        </w:trPr>
+        <w:tc>
+          <w:tcPr>
+            <w:tcW w:w="1748" w:type="dxa"/>
+            <w:tcBorders>
+              <w:top w:val="single" w:color="auto" w:sz="4" w:space="0"/>
+              <w:left w:val="single" w:color="auto" w:sz="4" w:space="0"/>
+              <w:bottom w:val="single" w:color="auto" w:sz="4" w:space="0"/>
+              <w:right w:val="single" w:color="auto" w:sz="4" w:space="0"/>
+            </w:tcBorders>
+            <w:shd w:val="clear"/>
+            <w:tcMar>
+              <w:top w:w="96" w:type="dxa"/>
+              <w:left w:w="144" w:type="dxa"/>
+              <w:bottom w:w="96" w:type="dxa"/>
+              <w:right w:w="144" w:type="dxa"/>
+            </w:tcMar>
+            <w:vAlign w:val="center"/>
+          </w:tcPr>
+          <w:p>
+            <w:pPr>
+              <w:keepNext w:val="0"/>
+              <w:keepLines w:val="0"/>
+              <w:widowControl/>
+              <w:suppressLineNumbers w:val="0"/>
+              <w:bidi w:val="0"/>
+              <w:spacing w:before="0" w:beforeAutospacing="0" w:after="0" w:afterAutospacing="0" w:line="12" w:lineRule="atLeast"/>
+              <w:ind w:left="0" w:right="0"/>
+              <w:jc w:val="left"/>
+              <w:rPr>
+                <w:rFonts w:hint="default" w:ascii="Times New Roman" w:hAnsi="Times New Roman" w:eastAsia="sans-serif" w:cs="Times New Roman"/>
+                <w:strike w:val="0"/>
+                <w:dstrike w:val="0"/>
+                <w:color w:val="1F1F1F"/>
+                <w:sz w:val="26"/>
+                <w:szCs w:val="26"/>
+              </w:rPr>
+            </w:pPr>
+            <w:r>
+              <w:rPr>
+                <w:rFonts w:hint="default" w:ascii="Times New Roman" w:hAnsi="Times New Roman" w:eastAsia="sans-serif" w:cs="Times New Roman"/>
+                <w:b/>
+                <w:bCs/>
+                <w:strike w:val="0"/>
+                <w:dstrike w:val="0"/>
+                <w:color w:val="1F1F1F"/>
+                <w:kern w:val="0"/>
+                <w:sz w:val="26"/>
+                <w:szCs w:val="26"/>
+                <w:bdr w:val="none" w:color="1F1F1F" w:sz="0" w:space="0"/>
+                <w:lang w:val="en-US" w:eastAsia="zh-CN" w:bidi="ar"/>
+              </w:rPr>
+              <w:t>Time Window</w:t>
+            </w:r>
+          </w:p>
+        </w:tc>
+        <w:tc>
+          <w:tcPr>
+            <w:tcW w:w="0" w:type="auto"/>
+            <w:tcBorders>
+              <w:top w:val="single" w:color="auto" w:sz="4" w:space="0"/>
+              <w:left w:val="single" w:color="auto" w:sz="4" w:space="0"/>
+              <w:bottom w:val="single" w:color="auto" w:sz="4" w:space="0"/>
+              <w:right w:val="single" w:color="auto" w:sz="4" w:space="0"/>
+            </w:tcBorders>
+            <w:shd w:val="clear"/>
+            <w:tcMar>
+              <w:top w:w="96" w:type="dxa"/>
+              <w:left w:w="144" w:type="dxa"/>
+              <w:bottom w:w="96" w:type="dxa"/>
+              <w:right w:w="144" w:type="dxa"/>
+            </w:tcMar>
+            <w:vAlign w:val="center"/>
+          </w:tcPr>
+          <w:p>
+            <w:pPr>
+              <w:keepNext w:val="0"/>
+              <w:keepLines w:val="0"/>
+              <w:widowControl/>
+              <w:suppressLineNumbers w:val="0"/>
+              <w:bidi w:val="0"/>
+              <w:spacing w:before="0" w:beforeAutospacing="0" w:after="0" w:afterAutospacing="0" w:line="12" w:lineRule="atLeast"/>
+              <w:ind w:left="0" w:right="0"/>
+              <w:jc w:val="left"/>
+              <w:rPr>
+                <w:rFonts w:hint="default" w:ascii="Times New Roman" w:hAnsi="Times New Roman" w:eastAsia="sans-serif" w:cs="Times New Roman"/>
+                <w:strike w:val="0"/>
+                <w:dstrike w:val="0"/>
+                <w:color w:val="1F1F1F"/>
+                <w:sz w:val="26"/>
+                <w:szCs w:val="26"/>
+              </w:rPr>
+            </w:pPr>
+            <w:r>
+              <w:rPr>
+                <w:rFonts w:hint="default" w:ascii="Times New Roman" w:hAnsi="Times New Roman" w:eastAsia="sans-serif" w:cs="Times New Roman"/>
+                <w:strike w:val="0"/>
+                <w:dstrike w:val="0"/>
+                <w:color w:val="1F1F1F"/>
+                <w:kern w:val="0"/>
+                <w:sz w:val="26"/>
+                <w:szCs w:val="26"/>
+                <w:bdr w:val="none" w:color="1F1F1F" w:sz="0" w:space="0"/>
+                <w:lang w:val="en-US" w:eastAsia="zh-CN" w:bidi="ar"/>
+              </w:rPr>
+              <w:t>21:28 (Day 1) - 09:24 (Day 2)</w:t>
+            </w:r>
+          </w:p>
+        </w:tc>
+        <w:tc>
+          <w:tcPr>
+            <w:tcW w:w="3927" w:type="dxa"/>
+            <w:tcBorders>
+              <w:top w:val="single" w:color="auto" w:sz="4" w:space="0"/>
+              <w:left w:val="single" w:color="auto" w:sz="4" w:space="0"/>
+              <w:bottom w:val="single" w:color="auto" w:sz="4" w:space="0"/>
+              <w:right w:val="single" w:color="auto" w:sz="4" w:space="0"/>
+            </w:tcBorders>
+            <w:shd w:val="clear"/>
+            <w:tcMar>
+              <w:top w:w="96" w:type="dxa"/>
+              <w:left w:w="144" w:type="dxa"/>
+              <w:bottom w:w="96" w:type="dxa"/>
+              <w:right w:w="144" w:type="dxa"/>
+            </w:tcMar>
+            <w:vAlign w:val="center"/>
+          </w:tcPr>
+          <w:p>
+            <w:pPr>
+              <w:keepNext w:val="0"/>
+              <w:keepLines w:val="0"/>
+              <w:widowControl/>
+              <w:suppressLineNumbers w:val="0"/>
+              <w:bidi w:val="0"/>
+              <w:spacing w:before="0" w:beforeAutospacing="0" w:after="0" w:afterAutospacing="0" w:line="12" w:lineRule="atLeast"/>
+              <w:ind w:left="0" w:right="0"/>
+              <w:jc w:val="left"/>
+              <w:rPr>
+                <w:rFonts w:hint="default" w:ascii="Times New Roman" w:hAnsi="Times New Roman" w:eastAsia="sans-serif" w:cs="Times New Roman"/>
+                <w:strike w:val="0"/>
+                <w:dstrike w:val="0"/>
+                <w:color w:val="1F1F1F"/>
+                <w:sz w:val="26"/>
+                <w:szCs w:val="26"/>
+              </w:rPr>
+            </w:pPr>
+            <w:r>
+              <w:rPr>
+                <w:rFonts w:hint="default" w:ascii="Times New Roman" w:hAnsi="Times New Roman" w:eastAsia="sans-serif" w:cs="Times New Roman"/>
+                <w:strike w:val="0"/>
+                <w:dstrike w:val="0"/>
+                <w:color w:val="1F1F1F"/>
+                <w:kern w:val="0"/>
+                <w:sz w:val="26"/>
+                <w:szCs w:val="26"/>
+                <w:bdr w:val="none" w:color="1F1F1F" w:sz="0" w:space="0"/>
+                <w:lang w:val="en-US" w:eastAsia="zh-CN" w:bidi="ar"/>
+              </w:rPr>
+              <w:t>09:24 (Day 2) - 21:28 (Day 2)</w:t>
+            </w:r>
+          </w:p>
+        </w:tc>
+      </w:tr>
+      <w:tr>
+        <w:tblPrEx>
+          <w:tblBorders>
+            <w:top w:val="none" w:color="1F1F1F" w:sz="0" w:space="0"/>
+            <w:left w:val="none" w:color="1F1F1F" w:sz="0" w:space="0"/>
+            <w:bottom w:val="none" w:color="1F1F1F" w:sz="0" w:space="0"/>
+            <w:right w:val="none" w:color="1F1F1F" w:sz="0" w:space="0"/>
+            <w:insideH w:val="none" w:color="auto" w:sz="0" w:space="0"/>
+            <w:insideV w:val="none" w:color="auto" w:sz="0" w:space="0"/>
+          </w:tblBorders>
+          <w:tblCellMar>
+            <w:top w:w="0" w:type="dxa"/>
+            <w:left w:w="0" w:type="dxa"/>
+            <w:bottom w:w="0" w:type="dxa"/>
+            <w:right w:w="0" w:type="dxa"/>
+          </w:tblCellMar>
+        </w:tblPrEx>
+        <w:trPr>
+          <w:tblCellSpacing w:w="15" w:type="dxa"/>
+        </w:trPr>
+        <w:tc>
+          <w:tcPr>
+            <w:tcW w:w="1748" w:type="dxa"/>
+            <w:tcBorders>
+              <w:top w:val="single" w:color="auto" w:sz="4" w:space="0"/>
+              <w:left w:val="single" w:color="auto" w:sz="4" w:space="0"/>
+              <w:bottom w:val="single" w:color="auto" w:sz="4" w:space="0"/>
+              <w:right w:val="single" w:color="auto" w:sz="4" w:space="0"/>
+            </w:tcBorders>
+            <w:shd w:val="clear"/>
+            <w:tcMar>
+              <w:top w:w="96" w:type="dxa"/>
+              <w:left w:w="144" w:type="dxa"/>
+              <w:bottom w:w="96" w:type="dxa"/>
+              <w:right w:w="144" w:type="dxa"/>
+            </w:tcMar>
+            <w:vAlign w:val="center"/>
+          </w:tcPr>
+          <w:p>
+            <w:pPr>
+              <w:keepNext w:val="0"/>
+              <w:keepLines w:val="0"/>
+              <w:widowControl/>
+              <w:suppressLineNumbers w:val="0"/>
+              <w:bidi w:val="0"/>
+              <w:spacing w:before="0" w:beforeAutospacing="0" w:after="0" w:afterAutospacing="0" w:line="12" w:lineRule="atLeast"/>
+              <w:ind w:left="0" w:right="0"/>
+              <w:jc w:val="left"/>
+              <w:rPr>
+                <w:rFonts w:hint="default" w:ascii="Times New Roman" w:hAnsi="Times New Roman" w:eastAsia="sans-serif" w:cs="Times New Roman"/>
+                <w:strike w:val="0"/>
+                <w:dstrike w:val="0"/>
+                <w:color w:val="1F1F1F"/>
+                <w:sz w:val="26"/>
+                <w:szCs w:val="26"/>
+              </w:rPr>
+            </w:pPr>
+            <w:r>
+              <w:rPr>
+                <w:rFonts w:hint="default" w:ascii="Times New Roman" w:hAnsi="Times New Roman" w:eastAsia="sans-serif" w:cs="Times New Roman"/>
+                <w:b/>
+                <w:bCs/>
+                <w:strike w:val="0"/>
+                <w:dstrike w:val="0"/>
+                <w:color w:val="1F1F1F"/>
+                <w:kern w:val="0"/>
+                <w:sz w:val="26"/>
+                <w:szCs w:val="26"/>
+                <w:bdr w:val="none" w:color="1F1F1F" w:sz="0" w:space="0"/>
+                <w:lang w:val="en-US" w:eastAsia="zh-CN" w:bidi="ar"/>
+              </w:rPr>
+              <w:t>Duration</w:t>
+            </w:r>
+          </w:p>
+        </w:tc>
+        <w:tc>
+          <w:tcPr>
+            <w:tcW w:w="0" w:type="auto"/>
+            <w:tcBorders>
+              <w:top w:val="single" w:color="auto" w:sz="4" w:space="0"/>
+              <w:left w:val="single" w:color="auto" w:sz="4" w:space="0"/>
+              <w:bottom w:val="single" w:color="auto" w:sz="4" w:space="0"/>
+              <w:right w:val="single" w:color="auto" w:sz="4" w:space="0"/>
+            </w:tcBorders>
+            <w:shd w:val="clear"/>
+            <w:tcMar>
+              <w:top w:w="96" w:type="dxa"/>
+              <w:left w:w="144" w:type="dxa"/>
+              <w:bottom w:w="96" w:type="dxa"/>
+              <w:right w:w="144" w:type="dxa"/>
+            </w:tcMar>
+            <w:vAlign w:val="center"/>
+          </w:tcPr>
+          <w:p>
+            <w:pPr>
+              <w:keepNext w:val="0"/>
+              <w:keepLines w:val="0"/>
+              <w:widowControl/>
+              <w:suppressLineNumbers w:val="0"/>
+              <w:bidi w:val="0"/>
+              <w:spacing w:before="0" w:beforeAutospacing="0" w:after="0" w:afterAutospacing="0" w:line="12" w:lineRule="atLeast"/>
+              <w:ind w:left="0" w:right="0"/>
+              <w:jc w:val="left"/>
+              <w:rPr>
+                <w:rFonts w:hint="default" w:ascii="Times New Roman" w:hAnsi="Times New Roman" w:eastAsia="sans-serif" w:cs="Times New Roman"/>
+                <w:strike w:val="0"/>
+                <w:dstrike w:val="0"/>
+                <w:color w:val="1F1F1F"/>
+                <w:sz w:val="26"/>
+                <w:szCs w:val="26"/>
+              </w:rPr>
+            </w:pPr>
+            <w:r>
+              <w:rPr>
+                <w:rFonts w:hint="default" w:ascii="Times New Roman" w:hAnsi="Times New Roman" w:eastAsia="sans-serif" w:cs="Times New Roman"/>
+                <w:b/>
+                <w:bCs/>
+                <w:strike w:val="0"/>
+                <w:dstrike w:val="0"/>
+                <w:color w:val="1F1F1F"/>
+                <w:kern w:val="0"/>
+                <w:sz w:val="26"/>
+                <w:szCs w:val="26"/>
+                <w:bdr w:val="none" w:color="1F1F1F" w:sz="0" w:space="0"/>
+                <w:lang w:val="en-US" w:eastAsia="zh-CN" w:bidi="ar"/>
+              </w:rPr>
+              <w:t>11 hours 56 minutes</w:t>
+            </w:r>
+          </w:p>
+        </w:tc>
+        <w:tc>
+          <w:tcPr>
+            <w:tcW w:w="3927" w:type="dxa"/>
+            <w:tcBorders>
+              <w:top w:val="single" w:color="auto" w:sz="4" w:space="0"/>
+              <w:left w:val="single" w:color="auto" w:sz="4" w:space="0"/>
+              <w:bottom w:val="single" w:color="auto" w:sz="4" w:space="0"/>
+              <w:right w:val="single" w:color="auto" w:sz="4" w:space="0"/>
+            </w:tcBorders>
+            <w:shd w:val="clear"/>
+            <w:tcMar>
+              <w:top w:w="96" w:type="dxa"/>
+              <w:left w:w="144" w:type="dxa"/>
+              <w:bottom w:w="96" w:type="dxa"/>
+              <w:right w:w="144" w:type="dxa"/>
+            </w:tcMar>
+            <w:vAlign w:val="center"/>
+          </w:tcPr>
+          <w:p>
+            <w:pPr>
+              <w:keepNext w:val="0"/>
+              <w:keepLines w:val="0"/>
+              <w:widowControl/>
+              <w:suppressLineNumbers w:val="0"/>
+              <w:bidi w:val="0"/>
+              <w:spacing w:before="0" w:beforeAutospacing="0" w:after="0" w:afterAutospacing="0" w:line="12" w:lineRule="atLeast"/>
+              <w:ind w:left="0" w:right="0"/>
+              <w:jc w:val="left"/>
+              <w:rPr>
+                <w:rFonts w:hint="default" w:ascii="Times New Roman" w:hAnsi="Times New Roman" w:eastAsia="sans-serif" w:cs="Times New Roman"/>
+                <w:strike w:val="0"/>
+                <w:dstrike w:val="0"/>
+                <w:color w:val="1F1F1F"/>
+                <w:sz w:val="26"/>
+                <w:szCs w:val="26"/>
+              </w:rPr>
+            </w:pPr>
+            <w:r>
+              <w:rPr>
+                <w:rFonts w:hint="default" w:ascii="Times New Roman" w:hAnsi="Times New Roman" w:eastAsia="sans-serif" w:cs="Times New Roman"/>
+                <w:strike w:val="0"/>
+                <w:dstrike w:val="0"/>
+                <w:color w:val="1F1F1F"/>
+                <w:kern w:val="0"/>
+                <w:sz w:val="26"/>
+                <w:szCs w:val="26"/>
+                <w:bdr w:val="none" w:color="1F1F1F" w:sz="0" w:space="0"/>
+                <w:lang w:val="en-US" w:eastAsia="zh-CN" w:bidi="ar"/>
+              </w:rPr>
+              <w:t>12 hours 04 minutes</w:t>
+            </w:r>
+          </w:p>
+        </w:tc>
+      </w:tr>
+      <w:tr>
+        <w:tblPrEx>
+          <w:tblBorders>
+            <w:top w:val="none" w:color="1F1F1F" w:sz="0" w:space="0"/>
+            <w:left w:val="none" w:color="1F1F1F" w:sz="0" w:space="0"/>
+            <w:bottom w:val="none" w:color="1F1F1F" w:sz="0" w:space="0"/>
+            <w:right w:val="none" w:color="1F1F1F" w:sz="0" w:space="0"/>
+            <w:insideH w:val="none" w:color="auto" w:sz="0" w:space="0"/>
+            <w:insideV w:val="none" w:color="auto" w:sz="0" w:space="0"/>
+          </w:tblBorders>
+          <w:shd w:val="clear"/>
+          <w:tblCellMar>
+            <w:top w:w="0" w:type="dxa"/>
+            <w:left w:w="0" w:type="dxa"/>
+            <w:bottom w:w="0" w:type="dxa"/>
+            <w:right w:w="0" w:type="dxa"/>
+          </w:tblCellMar>
+        </w:tblPrEx>
+        <w:trPr>
+          <w:tblCellSpacing w:w="15" w:type="dxa"/>
+        </w:trPr>
+        <w:tc>
+          <w:tcPr>
+            <w:tcW w:w="1748" w:type="dxa"/>
+            <w:tcBorders>
+              <w:top w:val="single" w:color="auto" w:sz="4" w:space="0"/>
+              <w:left w:val="single" w:color="auto" w:sz="4" w:space="0"/>
+              <w:bottom w:val="single" w:color="auto" w:sz="4" w:space="0"/>
+              <w:right w:val="single" w:color="auto" w:sz="4" w:space="0"/>
+            </w:tcBorders>
+            <w:shd w:val="clear"/>
+            <w:tcMar>
+              <w:top w:w="96" w:type="dxa"/>
+              <w:left w:w="144" w:type="dxa"/>
+              <w:bottom w:w="96" w:type="dxa"/>
+              <w:right w:w="144" w:type="dxa"/>
+            </w:tcMar>
+            <w:vAlign w:val="center"/>
+          </w:tcPr>
+          <w:p>
+            <w:pPr>
+              <w:keepNext w:val="0"/>
+              <w:keepLines w:val="0"/>
+              <w:widowControl/>
+              <w:suppressLineNumbers w:val="0"/>
+              <w:bidi w:val="0"/>
+              <w:spacing w:before="0" w:beforeAutospacing="0" w:after="0" w:afterAutospacing="0" w:line="12" w:lineRule="atLeast"/>
+              <w:ind w:left="0" w:right="0"/>
+              <w:jc w:val="left"/>
+              <w:rPr>
+                <w:rFonts w:hint="default" w:ascii="Times New Roman" w:hAnsi="Times New Roman" w:eastAsia="sans-serif" w:cs="Times New Roman"/>
+                <w:strike w:val="0"/>
+                <w:dstrike w:val="0"/>
+                <w:color w:val="1F1F1F"/>
+                <w:sz w:val="26"/>
+                <w:szCs w:val="26"/>
+              </w:rPr>
+            </w:pPr>
+            <w:r>
+              <w:rPr>
+                <w:rFonts w:hint="default" w:ascii="Times New Roman" w:hAnsi="Times New Roman" w:eastAsia="sans-serif" w:cs="Times New Roman"/>
+                <w:b/>
+                <w:bCs/>
+                <w:strike w:val="0"/>
+                <w:dstrike w:val="0"/>
+                <w:color w:val="1F1F1F"/>
+                <w:kern w:val="0"/>
+                <w:sz w:val="26"/>
+                <w:szCs w:val="26"/>
+                <w:bdr w:val="none" w:color="1F1F1F" w:sz="0" w:space="0"/>
+                <w:lang w:val="en-US" w:eastAsia="zh-CN" w:bidi="ar"/>
+              </w:rPr>
+              <w:t>Total Requests</w:t>
+            </w:r>
+          </w:p>
+        </w:tc>
+        <w:tc>
+          <w:tcPr>
+            <w:tcW w:w="0" w:type="auto"/>
+            <w:tcBorders>
+              <w:top w:val="single" w:color="auto" w:sz="4" w:space="0"/>
+              <w:left w:val="single" w:color="auto" w:sz="4" w:space="0"/>
+              <w:bottom w:val="single" w:color="auto" w:sz="4" w:space="0"/>
+              <w:right w:val="single" w:color="auto" w:sz="4" w:space="0"/>
+            </w:tcBorders>
+            <w:shd w:val="clear"/>
+            <w:tcMar>
+              <w:top w:w="96" w:type="dxa"/>
+              <w:left w:w="144" w:type="dxa"/>
+              <w:bottom w:w="96" w:type="dxa"/>
+              <w:right w:w="144" w:type="dxa"/>
+            </w:tcMar>
+            <w:vAlign w:val="center"/>
+          </w:tcPr>
+          <w:p>
+            <w:pPr>
+              <w:keepNext w:val="0"/>
+              <w:keepLines w:val="0"/>
+              <w:widowControl/>
+              <w:suppressLineNumbers w:val="0"/>
+              <w:bidi w:val="0"/>
+              <w:spacing w:before="0" w:beforeAutospacing="0" w:after="0" w:afterAutospacing="0" w:line="12" w:lineRule="atLeast"/>
+              <w:ind w:left="0" w:right="0"/>
+              <w:jc w:val="left"/>
+              <w:rPr>
+                <w:rFonts w:hint="default" w:ascii="Times New Roman" w:hAnsi="Times New Roman" w:eastAsia="sans-serif" w:cs="Times New Roman"/>
+                <w:strike w:val="0"/>
+                <w:dstrike w:val="0"/>
+                <w:color w:val="1F1F1F"/>
+                <w:sz w:val="26"/>
+                <w:szCs w:val="26"/>
+              </w:rPr>
+            </w:pPr>
+            <w:r>
+              <w:rPr>
+                <w:rFonts w:hint="default" w:ascii="Times New Roman" w:hAnsi="Times New Roman" w:eastAsia="sans-serif" w:cs="Times New Roman"/>
+                <w:strike w:val="0"/>
+                <w:dstrike w:val="0"/>
+                <w:color w:val="1F1F1F"/>
+                <w:kern w:val="0"/>
+                <w:sz w:val="26"/>
+                <w:szCs w:val="26"/>
+                <w:bdr w:val="none" w:color="1F1F1F" w:sz="0" w:space="0"/>
+                <w:lang w:val="en-US" w:eastAsia="zh-CN" w:bidi="ar"/>
+              </w:rPr>
+              <w:t>848</w:t>
+            </w:r>
+          </w:p>
+        </w:tc>
+        <w:tc>
+          <w:tcPr>
+            <w:tcW w:w="3927" w:type="dxa"/>
+            <w:tcBorders>
+              <w:top w:val="single" w:color="auto" w:sz="4" w:space="0"/>
+              <w:left w:val="single" w:color="auto" w:sz="4" w:space="0"/>
+              <w:bottom w:val="single" w:color="auto" w:sz="4" w:space="0"/>
+              <w:right w:val="single" w:color="auto" w:sz="4" w:space="0"/>
+            </w:tcBorders>
+            <w:shd w:val="clear"/>
+            <w:tcMar>
+              <w:top w:w="96" w:type="dxa"/>
+              <w:left w:w="144" w:type="dxa"/>
+              <w:bottom w:w="96" w:type="dxa"/>
+              <w:right w:w="144" w:type="dxa"/>
+            </w:tcMar>
+            <w:vAlign w:val="center"/>
+          </w:tcPr>
+          <w:p>
+            <w:pPr>
+              <w:keepNext w:val="0"/>
+              <w:keepLines w:val="0"/>
+              <w:widowControl/>
+              <w:suppressLineNumbers w:val="0"/>
+              <w:bidi w:val="0"/>
+              <w:spacing w:before="0" w:beforeAutospacing="0" w:after="0" w:afterAutospacing="0" w:line="12" w:lineRule="atLeast"/>
+              <w:ind w:left="0" w:right="0"/>
+              <w:jc w:val="left"/>
+              <w:rPr>
+                <w:rFonts w:hint="default" w:ascii="Times New Roman" w:hAnsi="Times New Roman" w:eastAsia="sans-serif" w:cs="Times New Roman"/>
+                <w:strike w:val="0"/>
+                <w:dstrike w:val="0"/>
+                <w:color w:val="1F1F1F"/>
+                <w:sz w:val="26"/>
+                <w:szCs w:val="26"/>
+              </w:rPr>
+            </w:pPr>
+            <w:r>
+              <w:rPr>
+                <w:rFonts w:hint="default" w:ascii="Times New Roman" w:hAnsi="Times New Roman" w:eastAsia="sans-serif" w:cs="Times New Roman"/>
+                <w:strike w:val="0"/>
+                <w:dstrike w:val="0"/>
+                <w:color w:val="1F1F1F"/>
+                <w:kern w:val="0"/>
+                <w:sz w:val="26"/>
+                <w:szCs w:val="26"/>
+                <w:bdr w:val="none" w:color="1F1F1F" w:sz="0" w:space="0"/>
+                <w:lang w:val="en-US" w:eastAsia="zh-CN" w:bidi="ar"/>
+              </w:rPr>
+              <w:t>576</w:t>
+            </w:r>
+          </w:p>
+        </w:tc>
+      </w:tr>
+      <w:tr>
+        <w:tblPrEx>
+          <w:tblBorders>
+            <w:top w:val="none" w:color="1F1F1F" w:sz="0" w:space="0"/>
+            <w:left w:val="none" w:color="1F1F1F" w:sz="0" w:space="0"/>
+            <w:bottom w:val="none" w:color="1F1F1F" w:sz="0" w:space="0"/>
+            <w:right w:val="none" w:color="1F1F1F" w:sz="0" w:space="0"/>
+            <w:insideH w:val="none" w:color="auto" w:sz="0" w:space="0"/>
+            <w:insideV w:val="none" w:color="auto" w:sz="0" w:space="0"/>
+          </w:tblBorders>
+          <w:shd w:val="clear"/>
+          <w:tblCellMar>
+            <w:top w:w="0" w:type="dxa"/>
+            <w:left w:w="0" w:type="dxa"/>
+            <w:bottom w:w="0" w:type="dxa"/>
+            <w:right w:w="0" w:type="dxa"/>
+          </w:tblCellMar>
+        </w:tblPrEx>
+        <w:trPr>
+          <w:tblCellSpacing w:w="15" w:type="dxa"/>
+        </w:trPr>
+        <w:tc>
+          <w:tcPr>
+            <w:tcW w:w="1748" w:type="dxa"/>
+            <w:tcBorders>
+              <w:top w:val="single" w:color="auto" w:sz="4" w:space="0"/>
+              <w:left w:val="single" w:color="auto" w:sz="4" w:space="0"/>
+              <w:bottom w:val="single" w:color="auto" w:sz="4" w:space="0"/>
+              <w:right w:val="single" w:color="auto" w:sz="4" w:space="0"/>
+            </w:tcBorders>
+            <w:shd w:val="clear"/>
+            <w:tcMar>
+              <w:top w:w="96" w:type="dxa"/>
+              <w:left w:w="144" w:type="dxa"/>
+              <w:bottom w:w="96" w:type="dxa"/>
+              <w:right w:w="144" w:type="dxa"/>
+            </w:tcMar>
+            <w:vAlign w:val="center"/>
+          </w:tcPr>
+          <w:p>
+            <w:pPr>
+              <w:keepNext w:val="0"/>
+              <w:keepLines w:val="0"/>
+              <w:widowControl/>
+              <w:suppressLineNumbers w:val="0"/>
+              <w:bidi w:val="0"/>
+              <w:spacing w:before="0" w:beforeAutospacing="0" w:after="0" w:afterAutospacing="0" w:line="12" w:lineRule="atLeast"/>
+              <w:ind w:left="0" w:right="0"/>
+              <w:jc w:val="left"/>
+              <w:rPr>
+                <w:rFonts w:hint="default" w:ascii="Times New Roman" w:hAnsi="Times New Roman" w:eastAsia="sans-serif" w:cs="Times New Roman"/>
+                <w:strike w:val="0"/>
+                <w:dstrike w:val="0"/>
+                <w:color w:val="1F1F1F"/>
+                <w:sz w:val="26"/>
+                <w:szCs w:val="26"/>
+              </w:rPr>
+            </w:pPr>
+            <w:r>
+              <w:rPr>
+                <w:rFonts w:hint="default" w:ascii="Times New Roman" w:hAnsi="Times New Roman" w:eastAsia="sans-serif" w:cs="Times New Roman"/>
+                <w:b/>
+                <w:bCs/>
+                <w:strike w:val="0"/>
+                <w:dstrike w:val="0"/>
+                <w:color w:val="1F1F1F"/>
+                <w:kern w:val="0"/>
+                <w:sz w:val="26"/>
+                <w:szCs w:val="26"/>
+                <w:bdr w:val="none" w:color="1F1F1F" w:sz="0" w:space="0"/>
+                <w:lang w:val="en-US" w:eastAsia="zh-CN" w:bidi="ar"/>
+              </w:rPr>
+              <w:t>Success Rate</w:t>
+            </w:r>
+          </w:p>
+        </w:tc>
+        <w:tc>
+          <w:tcPr>
+            <w:tcW w:w="0" w:type="auto"/>
+            <w:tcBorders>
+              <w:top w:val="single" w:color="auto" w:sz="4" w:space="0"/>
+              <w:left w:val="single" w:color="auto" w:sz="4" w:space="0"/>
+              <w:bottom w:val="single" w:color="auto" w:sz="4" w:space="0"/>
+              <w:right w:val="single" w:color="auto" w:sz="4" w:space="0"/>
+            </w:tcBorders>
+            <w:shd w:val="clear"/>
+            <w:tcMar>
+              <w:top w:w="96" w:type="dxa"/>
+              <w:left w:w="144" w:type="dxa"/>
+              <w:bottom w:w="96" w:type="dxa"/>
+              <w:right w:w="144" w:type="dxa"/>
+            </w:tcMar>
+            <w:vAlign w:val="center"/>
+          </w:tcPr>
+          <w:p>
+            <w:pPr>
+              <w:keepNext w:val="0"/>
+              <w:keepLines w:val="0"/>
+              <w:widowControl/>
+              <w:suppressLineNumbers w:val="0"/>
+              <w:bidi w:val="0"/>
+              <w:spacing w:before="0" w:beforeAutospacing="0" w:after="0" w:afterAutospacing="0" w:line="12" w:lineRule="atLeast"/>
+              <w:ind w:left="0" w:right="0"/>
+              <w:jc w:val="left"/>
+              <w:rPr>
+                <w:rFonts w:hint="default" w:ascii="Times New Roman" w:hAnsi="Times New Roman" w:eastAsia="sans-serif" w:cs="Times New Roman"/>
+                <w:strike w:val="0"/>
+                <w:dstrike w:val="0"/>
+                <w:color w:val="1F1F1F"/>
+                <w:sz w:val="26"/>
+                <w:szCs w:val="26"/>
+              </w:rPr>
+            </w:pPr>
+            <w:r>
+              <w:rPr>
+                <w:rFonts w:hint="default" w:ascii="Times New Roman" w:hAnsi="Times New Roman" w:eastAsia="sans-serif" w:cs="Times New Roman"/>
+                <w:b/>
+                <w:bCs/>
+                <w:strike w:val="0"/>
+                <w:dstrike w:val="0"/>
+                <w:color w:val="1F1F1F"/>
+                <w:kern w:val="0"/>
+                <w:sz w:val="26"/>
+                <w:szCs w:val="26"/>
+                <w:bdr w:val="none" w:color="1F1F1F" w:sz="0" w:space="0"/>
+                <w:lang w:val="en-US" w:eastAsia="zh-CN" w:bidi="ar"/>
+              </w:rPr>
+              <w:t>100%</w:t>
+            </w:r>
+          </w:p>
+        </w:tc>
+        <w:tc>
+          <w:tcPr>
+            <w:tcW w:w="3927" w:type="dxa"/>
+            <w:tcBorders>
+              <w:top w:val="single" w:color="auto" w:sz="4" w:space="0"/>
+              <w:left w:val="single" w:color="auto" w:sz="4" w:space="0"/>
+              <w:bottom w:val="single" w:color="auto" w:sz="4" w:space="0"/>
+              <w:right w:val="single" w:color="auto" w:sz="4" w:space="0"/>
+            </w:tcBorders>
+            <w:shd w:val="clear"/>
+            <w:tcMar>
+              <w:top w:w="96" w:type="dxa"/>
+              <w:left w:w="144" w:type="dxa"/>
+              <w:bottom w:w="96" w:type="dxa"/>
+              <w:right w:w="144" w:type="dxa"/>
+            </w:tcMar>
+            <w:vAlign w:val="center"/>
+          </w:tcPr>
+          <w:p>
+            <w:pPr>
+              <w:keepNext w:val="0"/>
+              <w:keepLines w:val="0"/>
+              <w:widowControl/>
+              <w:suppressLineNumbers w:val="0"/>
+              <w:bidi w:val="0"/>
+              <w:spacing w:before="0" w:beforeAutospacing="0" w:after="0" w:afterAutospacing="0" w:line="12" w:lineRule="atLeast"/>
+              <w:ind w:left="0" w:right="0"/>
+              <w:jc w:val="left"/>
+              <w:rPr>
+                <w:rFonts w:hint="default" w:ascii="Times New Roman" w:hAnsi="Times New Roman" w:eastAsia="sans-serif" w:cs="Times New Roman"/>
+                <w:strike w:val="0"/>
+                <w:dstrike w:val="0"/>
+                <w:color w:val="1F1F1F"/>
+                <w:sz w:val="26"/>
+                <w:szCs w:val="26"/>
+              </w:rPr>
+            </w:pPr>
+            <w:r>
+              <w:rPr>
+                <w:rFonts w:hint="default" w:ascii="Times New Roman" w:hAnsi="Times New Roman" w:eastAsia="sans-serif" w:cs="Times New Roman"/>
+                <w:strike w:val="0"/>
+                <w:dstrike w:val="0"/>
+                <w:color w:val="1F1F1F"/>
+                <w:kern w:val="0"/>
+                <w:sz w:val="26"/>
+                <w:szCs w:val="26"/>
+                <w:bdr w:val="none" w:color="1F1F1F" w:sz="0" w:space="0"/>
+                <w:lang w:val="en-US" w:eastAsia="zh-CN" w:bidi="ar"/>
+              </w:rPr>
+              <w:t>0% (System denied by Provider)</w:t>
+            </w:r>
+          </w:p>
+        </w:tc>
+      </w:tr>
+      <w:tr>
+        <w:tblPrEx>
+          <w:tblBorders>
+            <w:top w:val="none" w:color="1F1F1F" w:sz="0" w:space="0"/>
+            <w:left w:val="none" w:color="1F1F1F" w:sz="0" w:space="0"/>
+            <w:bottom w:val="none" w:color="1F1F1F" w:sz="0" w:space="0"/>
+            <w:right w:val="none" w:color="1F1F1F" w:sz="0" w:space="0"/>
+            <w:insideH w:val="none" w:color="auto" w:sz="0" w:space="0"/>
+            <w:insideV w:val="none" w:color="auto" w:sz="0" w:space="0"/>
+          </w:tblBorders>
+          <w:shd w:val="clear"/>
+          <w:tblCellMar>
+            <w:top w:w="0" w:type="dxa"/>
+            <w:left w:w="0" w:type="dxa"/>
+            <w:bottom w:w="0" w:type="dxa"/>
+            <w:right w:w="0" w:type="dxa"/>
+          </w:tblCellMar>
+        </w:tblPrEx>
+        <w:trPr>
+          <w:tblCellSpacing w:w="15" w:type="dxa"/>
+        </w:trPr>
+        <w:tc>
+          <w:tcPr>
+            <w:tcW w:w="1748" w:type="dxa"/>
+            <w:tcBorders>
+              <w:top w:val="single" w:color="auto" w:sz="4" w:space="0"/>
+              <w:left w:val="single" w:color="auto" w:sz="4" w:space="0"/>
+              <w:bottom w:val="single" w:color="auto" w:sz="4" w:space="0"/>
+              <w:right w:val="single" w:color="auto" w:sz="4" w:space="0"/>
+            </w:tcBorders>
+            <w:shd w:val="clear"/>
+            <w:tcMar>
+              <w:top w:w="96" w:type="dxa"/>
+              <w:left w:w="144" w:type="dxa"/>
+              <w:bottom w:w="96" w:type="dxa"/>
+              <w:right w:w="144" w:type="dxa"/>
+            </w:tcMar>
+            <w:vAlign w:val="center"/>
+          </w:tcPr>
+          <w:p>
+            <w:pPr>
+              <w:keepNext w:val="0"/>
+              <w:keepLines w:val="0"/>
+              <w:widowControl/>
+              <w:suppressLineNumbers w:val="0"/>
+              <w:bidi w:val="0"/>
+              <w:spacing w:before="0" w:beforeAutospacing="0" w:after="0" w:afterAutospacing="0" w:line="12" w:lineRule="atLeast"/>
+              <w:ind w:left="0" w:right="0"/>
+              <w:jc w:val="left"/>
+              <w:rPr>
+                <w:rFonts w:hint="default" w:ascii="Times New Roman" w:hAnsi="Times New Roman" w:eastAsia="sans-serif" w:cs="Times New Roman"/>
+                <w:strike w:val="0"/>
+                <w:dstrike w:val="0"/>
+                <w:color w:val="1F1F1F"/>
+                <w:sz w:val="26"/>
+                <w:szCs w:val="26"/>
+              </w:rPr>
+            </w:pPr>
+            <w:r>
+              <w:rPr>
+                <w:rFonts w:hint="default" w:ascii="Times New Roman" w:hAnsi="Times New Roman" w:eastAsia="sans-serif" w:cs="Times New Roman"/>
+                <w:b/>
+                <w:bCs/>
+                <w:strike w:val="0"/>
+                <w:dstrike w:val="0"/>
+                <w:color w:val="1F1F1F"/>
+                <w:kern w:val="0"/>
+                <w:sz w:val="26"/>
+                <w:szCs w:val="26"/>
+                <w:bdr w:val="none" w:color="1F1F1F" w:sz="0" w:space="0"/>
+                <w:lang w:val="en-US" w:eastAsia="zh-CN" w:bidi="ar"/>
+              </w:rPr>
+              <w:t>Avg Latency</w:t>
+            </w:r>
+          </w:p>
+        </w:tc>
+        <w:tc>
+          <w:tcPr>
+            <w:tcW w:w="0" w:type="auto"/>
+            <w:tcBorders>
+              <w:top w:val="single" w:color="auto" w:sz="4" w:space="0"/>
+              <w:left w:val="single" w:color="auto" w:sz="4" w:space="0"/>
+              <w:bottom w:val="single" w:color="auto" w:sz="4" w:space="0"/>
+              <w:right w:val="single" w:color="auto" w:sz="4" w:space="0"/>
+            </w:tcBorders>
+            <w:shd w:val="clear"/>
+            <w:tcMar>
+              <w:top w:w="96" w:type="dxa"/>
+              <w:left w:w="144" w:type="dxa"/>
+              <w:bottom w:w="96" w:type="dxa"/>
+              <w:right w:w="144" w:type="dxa"/>
+            </w:tcMar>
+            <w:vAlign w:val="center"/>
+          </w:tcPr>
+          <w:p>
+            <w:pPr>
+              <w:keepNext w:val="0"/>
+              <w:keepLines w:val="0"/>
+              <w:widowControl/>
+              <w:suppressLineNumbers w:val="0"/>
+              <w:bidi w:val="0"/>
+              <w:spacing w:before="0" w:beforeAutospacing="0" w:after="0" w:afterAutospacing="0" w:line="12" w:lineRule="atLeast"/>
+              <w:ind w:left="0" w:right="0"/>
+              <w:jc w:val="left"/>
+              <w:rPr>
+                <w:rFonts w:hint="default" w:ascii="Times New Roman" w:hAnsi="Times New Roman" w:eastAsia="sans-serif" w:cs="Times New Roman"/>
+                <w:strike w:val="0"/>
+                <w:dstrike w:val="0"/>
+                <w:color w:val="1F1F1F"/>
+                <w:sz w:val="26"/>
+                <w:szCs w:val="26"/>
+              </w:rPr>
+            </w:pPr>
+            <w:r>
+              <w:rPr>
+                <w:rFonts w:hint="default" w:ascii="Times New Roman" w:hAnsi="Times New Roman" w:eastAsia="sans-serif" w:cs="Times New Roman"/>
+                <w:b/>
+                <w:bCs/>
+                <w:strike w:val="0"/>
+                <w:dstrike w:val="0"/>
+                <w:color w:val="1F1F1F"/>
+                <w:kern w:val="0"/>
+                <w:sz w:val="26"/>
+                <w:szCs w:val="26"/>
+                <w:bdr w:val="none" w:color="1F1F1F" w:sz="0" w:space="0"/>
+                <w:lang w:val="en-US" w:eastAsia="zh-CN" w:bidi="ar"/>
+              </w:rPr>
+              <w:t>5.51 seconds</w:t>
+            </w:r>
+            <w:r>
+              <w:rPr>
+                <w:rFonts w:hint="default" w:ascii="Times New Roman" w:hAnsi="Times New Roman" w:eastAsia="sans-serif" w:cs="Times New Roman"/>
+                <w:strike w:val="0"/>
+                <w:dstrike w:val="0"/>
+                <w:color w:val="1F1F1F"/>
+                <w:kern w:val="0"/>
+                <w:sz w:val="26"/>
+                <w:szCs w:val="26"/>
+                <w:bdr w:val="none" w:color="1F1F1F" w:sz="0" w:space="0"/>
+                <w:lang w:val="en-US" w:eastAsia="zh-CN" w:bidi="ar"/>
+              </w:rPr>
+              <w:t xml:space="preserve"> (</w:t>
+            </w:r>
+            <m:oMath>
+              <m:r>
+                <m:rPr>
+                  <m:sty m:val="p"/>
+                </m:rPr>
+                <w:rPr>
+                  <w:rFonts w:ascii="Cambria Math" w:hAnsi="Cambria Math" w:cs="Times New Roman"/>
+                  <w:strike w:val="0"/>
+                  <w:dstrike w:val="0"/>
+                  <w:color w:val="1F1F1F"/>
+                  <w:kern w:val="0"/>
+                  <w:sz w:val="26"/>
+                  <w:szCs w:val="26"/>
+                  <w:bdr w:val="none" w:color="1F1F1F" w:sz="0" w:space="0"/>
+                  <w:lang w:val="en-US" w:bidi="ar"/>
+                </w:rPr>
+                <m:t>σ</m:t>
+              </m:r>
+              <m:r>
+                <m:rPr>
+                  <m:sty m:val="p"/>
+                </m:rPr>
+                <w:rPr>
+                  <w:rFonts w:hint="default" w:ascii="Cambria Math" w:hAnsi="Cambria Math" w:cs="Times New Roman"/>
+                  <w:strike w:val="0"/>
+                  <w:dstrike w:val="0"/>
+                  <w:color w:val="1F1F1F"/>
+                  <w:kern w:val="0"/>
+                  <w:sz w:val="26"/>
+                  <w:szCs w:val="26"/>
+                  <w:bdr w:val="none" w:color="1F1F1F" w:sz="0" w:space="0"/>
+                  <w:lang w:val="en-US" w:bidi="ar"/>
+                </w:rPr>
+                <m:t xml:space="preserve"> </m:t>
+              </m:r>
+            </m:oMath>
+            <w:r>
+              <w:rPr>
+                <w:rFonts w:hint="default" w:ascii="Times New Roman" w:hAnsi="Times New Roman" w:eastAsia="sans-serif" w:cs="Times New Roman"/>
+                <w:strike w:val="0"/>
+                <w:dstrike w:val="0"/>
+                <w:color w:val="1F1F1F"/>
+                <w:kern w:val="0"/>
+                <w:sz w:val="26"/>
+                <w:szCs w:val="26"/>
+                <w:bdr w:val="none" w:color="1F1F1F" w:sz="0" w:space="0"/>
+                <w:lang w:val="en-US" w:eastAsia="zh-CN" w:bidi="ar"/>
+              </w:rPr>
+              <w:t>= 4.6s)</w:t>
+            </w:r>
+          </w:p>
+        </w:tc>
+        <w:tc>
+          <w:tcPr>
+            <w:tcW w:w="3927" w:type="dxa"/>
+            <w:tcBorders>
+              <w:top w:val="single" w:color="auto" w:sz="4" w:space="0"/>
+              <w:left w:val="single" w:color="auto" w:sz="4" w:space="0"/>
+              <w:bottom w:val="single" w:color="auto" w:sz="4" w:space="0"/>
+              <w:right w:val="single" w:color="auto" w:sz="4" w:space="0"/>
+            </w:tcBorders>
+            <w:shd w:val="clear"/>
+            <w:tcMar>
+              <w:top w:w="96" w:type="dxa"/>
+              <w:left w:w="144" w:type="dxa"/>
+              <w:bottom w:w="96" w:type="dxa"/>
+              <w:right w:w="144" w:type="dxa"/>
+            </w:tcMar>
+            <w:vAlign w:val="center"/>
+          </w:tcPr>
+          <w:p>
+            <w:pPr>
+              <w:keepNext w:val="0"/>
+              <w:keepLines w:val="0"/>
+              <w:widowControl/>
+              <w:suppressLineNumbers w:val="0"/>
+              <w:bidi w:val="0"/>
+              <w:spacing w:before="0" w:beforeAutospacing="0" w:after="0" w:afterAutospacing="0" w:line="12" w:lineRule="atLeast"/>
+              <w:ind w:left="0" w:right="0"/>
+              <w:jc w:val="left"/>
+              <w:rPr>
+                <w:rFonts w:hint="default" w:ascii="Times New Roman" w:hAnsi="Times New Roman" w:eastAsia="sans-serif" w:cs="Times New Roman"/>
+                <w:strike w:val="0"/>
+                <w:dstrike w:val="0"/>
+                <w:color w:val="1F1F1F"/>
+                <w:sz w:val="26"/>
+                <w:szCs w:val="26"/>
+              </w:rPr>
+            </w:pPr>
+            <w:r>
+              <w:rPr>
+                <w:rFonts w:hint="default" w:ascii="Times New Roman" w:hAnsi="Times New Roman" w:eastAsia="sans-serif" w:cs="Times New Roman"/>
+                <w:strike w:val="0"/>
+                <w:dstrike w:val="0"/>
+                <w:color w:val="1F1F1F"/>
+                <w:kern w:val="0"/>
+                <w:sz w:val="26"/>
+                <w:szCs w:val="26"/>
+                <w:bdr w:val="none" w:color="1F1F1F" w:sz="0" w:space="0"/>
+                <w:lang w:val="en-US" w:eastAsia="zh-CN" w:bidi="ar"/>
+              </w:rPr>
+              <w:t>&gt; 45.0 seconds (Timeout)</w:t>
+            </w:r>
+          </w:p>
+        </w:tc>
+      </w:tr>
+      <w:tr>
+        <w:tblPrEx>
+          <w:tblBorders>
+            <w:top w:val="none" w:color="1F1F1F" w:sz="0" w:space="0"/>
+            <w:left w:val="none" w:color="1F1F1F" w:sz="0" w:space="0"/>
+            <w:bottom w:val="none" w:color="1F1F1F" w:sz="0" w:space="0"/>
+            <w:right w:val="none" w:color="1F1F1F" w:sz="0" w:space="0"/>
+            <w:insideH w:val="none" w:color="auto" w:sz="0" w:space="0"/>
+            <w:insideV w:val="none" w:color="auto" w:sz="0" w:space="0"/>
+          </w:tblBorders>
+          <w:shd w:val="clear"/>
+          <w:tblCellMar>
+            <w:top w:w="0" w:type="dxa"/>
+            <w:left w:w="0" w:type="dxa"/>
+            <w:bottom w:w="0" w:type="dxa"/>
+            <w:right w:w="0" w:type="dxa"/>
+          </w:tblCellMar>
+        </w:tblPrEx>
+        <w:trPr>
+          <w:tblCellSpacing w:w="15" w:type="dxa"/>
+        </w:trPr>
+        <w:tc>
+          <w:tcPr>
+            <w:tcW w:w="1748" w:type="dxa"/>
+            <w:tcBorders>
+              <w:top w:val="single" w:color="auto" w:sz="4" w:space="0"/>
+              <w:left w:val="single" w:color="auto" w:sz="4" w:space="0"/>
+              <w:bottom w:val="single" w:color="auto" w:sz="4" w:space="0"/>
+              <w:right w:val="single" w:color="auto" w:sz="4" w:space="0"/>
+            </w:tcBorders>
+            <w:shd w:val="clear"/>
+            <w:tcMar>
+              <w:top w:w="96" w:type="dxa"/>
+              <w:left w:w="144" w:type="dxa"/>
+              <w:bottom w:w="96" w:type="dxa"/>
+              <w:right w:w="144" w:type="dxa"/>
+            </w:tcMar>
+            <w:vAlign w:val="center"/>
+          </w:tcPr>
+          <w:p>
+            <w:pPr>
+              <w:keepNext w:val="0"/>
+              <w:keepLines w:val="0"/>
+              <w:widowControl/>
+              <w:suppressLineNumbers w:val="0"/>
+              <w:bidi w:val="0"/>
+              <w:spacing w:before="0" w:beforeAutospacing="0" w:after="0" w:afterAutospacing="0" w:line="12" w:lineRule="atLeast"/>
+              <w:ind w:left="0" w:right="0"/>
+              <w:jc w:val="left"/>
+              <w:rPr>
+                <w:rFonts w:hint="default" w:ascii="Times New Roman" w:hAnsi="Times New Roman" w:eastAsia="sans-serif" w:cs="Times New Roman"/>
+                <w:strike w:val="0"/>
+                <w:dstrike w:val="0"/>
+                <w:color w:val="1F1F1F"/>
+                <w:sz w:val="26"/>
+                <w:szCs w:val="26"/>
+              </w:rPr>
+            </w:pPr>
+            <w:r>
+              <w:rPr>
+                <w:rFonts w:hint="default" w:ascii="Times New Roman" w:hAnsi="Times New Roman" w:eastAsia="sans-serif" w:cs="Times New Roman"/>
+                <w:b/>
+                <w:bCs/>
+                <w:strike w:val="0"/>
+                <w:dstrike w:val="0"/>
+                <w:color w:val="1F1F1F"/>
+                <w:kern w:val="0"/>
+                <w:sz w:val="26"/>
+                <w:szCs w:val="26"/>
+                <w:bdr w:val="none" w:color="1F1F1F" w:sz="0" w:space="0"/>
+                <w:lang w:val="en-US" w:eastAsia="zh-CN" w:bidi="ar"/>
+              </w:rPr>
+              <w:t>System State</w:t>
+            </w:r>
+          </w:p>
+        </w:tc>
+        <w:tc>
+          <w:tcPr>
+            <w:tcW w:w="0" w:type="auto"/>
+            <w:tcBorders>
+              <w:top w:val="single" w:color="auto" w:sz="4" w:space="0"/>
+              <w:left w:val="single" w:color="auto" w:sz="4" w:space="0"/>
+              <w:bottom w:val="single" w:color="auto" w:sz="4" w:space="0"/>
+              <w:right w:val="single" w:color="auto" w:sz="4" w:space="0"/>
+            </w:tcBorders>
+            <w:shd w:val="clear"/>
+            <w:tcMar>
+              <w:top w:w="96" w:type="dxa"/>
+              <w:left w:w="144" w:type="dxa"/>
+              <w:bottom w:w="96" w:type="dxa"/>
+              <w:right w:w="144" w:type="dxa"/>
+            </w:tcMar>
+            <w:vAlign w:val="center"/>
+          </w:tcPr>
+          <w:p>
+            <w:pPr>
+              <w:keepNext w:val="0"/>
+              <w:keepLines w:val="0"/>
+              <w:widowControl/>
+              <w:suppressLineNumbers w:val="0"/>
+              <w:bidi w:val="0"/>
+              <w:spacing w:before="0" w:beforeAutospacing="0" w:after="0" w:afterAutospacing="0" w:line="12" w:lineRule="atLeast"/>
+              <w:ind w:left="0" w:right="0"/>
+              <w:jc w:val="left"/>
+              <w:rPr>
+                <w:rFonts w:hint="default" w:ascii="Times New Roman" w:hAnsi="Times New Roman" w:eastAsia="sans-serif" w:cs="Times New Roman"/>
+                <w:strike w:val="0"/>
+                <w:dstrike w:val="0"/>
+                <w:color w:val="1F1F1F"/>
+                <w:sz w:val="26"/>
+                <w:szCs w:val="26"/>
+              </w:rPr>
+            </w:pPr>
+            <w:r>
+              <w:rPr>
+                <w:rFonts w:hint="default" w:ascii="Times New Roman" w:hAnsi="Times New Roman" w:eastAsia="sans-serif" w:cs="Times New Roman"/>
+                <w:strike w:val="0"/>
+                <w:dstrike w:val="0"/>
+                <w:color w:val="1F1F1F"/>
+                <w:kern w:val="0"/>
+                <w:sz w:val="26"/>
+                <w:szCs w:val="26"/>
+                <w:bdr w:val="none" w:color="1F1F1F" w:sz="0" w:space="0"/>
+                <w:lang w:val="en-US" w:eastAsia="zh-CN" w:bidi="ar"/>
+              </w:rPr>
+              <w:t>Nominal</w:t>
+            </w:r>
+          </w:p>
+        </w:tc>
+        <w:tc>
+          <w:tcPr>
+            <w:tcW w:w="3927" w:type="dxa"/>
+            <w:tcBorders>
+              <w:top w:val="single" w:color="auto" w:sz="4" w:space="0"/>
+              <w:left w:val="single" w:color="auto" w:sz="4" w:space="0"/>
+              <w:bottom w:val="single" w:color="auto" w:sz="4" w:space="0"/>
+              <w:right w:val="single" w:color="auto" w:sz="4" w:space="0"/>
+            </w:tcBorders>
+            <w:shd w:val="clear"/>
+            <w:tcMar>
+              <w:top w:w="96" w:type="dxa"/>
+              <w:left w:w="144" w:type="dxa"/>
+              <w:bottom w:w="96" w:type="dxa"/>
+              <w:right w:w="144" w:type="dxa"/>
+            </w:tcMar>
+            <w:vAlign w:val="center"/>
+          </w:tcPr>
+          <w:p>
+            <w:pPr>
+              <w:keepNext w:val="0"/>
+              <w:keepLines w:val="0"/>
+              <w:widowControl/>
+              <w:suppressLineNumbers w:val="0"/>
+              <w:bidi w:val="0"/>
+              <w:spacing w:before="0" w:beforeAutospacing="0" w:after="0" w:afterAutospacing="0" w:line="12" w:lineRule="atLeast"/>
+              <w:ind w:left="0" w:right="0"/>
+              <w:jc w:val="left"/>
+              <w:rPr>
+                <w:rFonts w:hint="default" w:ascii="Times New Roman" w:hAnsi="Times New Roman" w:eastAsia="sans-serif" w:cs="Times New Roman"/>
+                <w:strike w:val="0"/>
+                <w:dstrike w:val="0"/>
+                <w:color w:val="1F1F1F"/>
+                <w:sz w:val="26"/>
+                <w:szCs w:val="26"/>
+              </w:rPr>
+            </w:pPr>
+            <w:r>
+              <w:rPr>
+                <w:rFonts w:hint="default" w:ascii="Times New Roman" w:hAnsi="Times New Roman" w:eastAsia="sans-serif" w:cs="Times New Roman"/>
+                <w:strike w:val="0"/>
+                <w:dstrike w:val="0"/>
+                <w:color w:val="1F1F1F"/>
+                <w:kern w:val="0"/>
+                <w:sz w:val="26"/>
+                <w:szCs w:val="26"/>
+                <w:bdr w:val="none" w:color="1F1F1F" w:sz="0" w:space="0"/>
+                <w:lang w:val="en-US" w:eastAsia="zh-CN" w:bidi="ar"/>
+              </w:rPr>
+              <w:t>Resource Starvation (External)</w:t>
+            </w:r>
+          </w:p>
+        </w:tc>
+      </w:tr>
+    </w:tbl>
+    <w:p>
+      <w:pPr>
+        <w:bidi w:val="0"/>
+        <w:rPr>
+          <w:rFonts w:hint="default" w:ascii="Times New Roman" w:hAnsi="Times New Roman" w:eastAsia="SimSun" w:cs="Times New Roman"/>
+          <w:sz w:val="26"/>
+          <w:szCs w:val="26"/>
+          <w:lang w:val="en-US"/>
+        </w:rPr>
+      </w:pPr>
+    </w:p>
+    <w:p>
+      <w:pPr>
+        <w:pStyle w:val="15"/>
+        <w:keepNext w:val="0"/>
+        <w:keepLines w:val="0"/>
+        <w:widowControl/>
+        <w:suppressLineNumbers w:val="0"/>
+        <w:spacing w:beforeAutospacing="1"/>
+        <w:rPr>
+          <w:rFonts w:hint="default" w:ascii="Times New Roman" w:hAnsi="Times New Roman" w:cs="Times New Roman"/>
+          <w:sz w:val="26"/>
+          <w:szCs w:val="26"/>
+        </w:rPr>
+      </w:pPr>
+      <w:r>
+        <w:rPr>
+          <w:rFonts w:hint="default" w:ascii="Times New Roman" w:hAnsi="Times New Roman" w:cs="Times New Roman"/>
+          <w:b/>
+          <w:bCs/>
+          <w:sz w:val="26"/>
+          <w:szCs w:val="26"/>
+        </w:rPr>
+        <w:t>Analysis of Phase 1 (Nominal Operation):</w:t>
+      </w:r>
+      <w:r>
+        <w:rPr>
+          <w:rFonts w:hint="default" w:ascii="Times New Roman" w:hAnsi="Times New Roman" w:cs="Times New Roman"/>
+          <w:sz w:val="26"/>
+          <w:szCs w:val="26"/>
+        </w:rPr>
+        <w:t xml:space="preserve"> During the first 12 hours, the system exhibited robust performance. The average latency of </w:t>
+      </w:r>
+      <w:r>
+        <w:rPr>
+          <w:rFonts w:hint="default" w:ascii="Times New Roman" w:hAnsi="Times New Roman" w:cs="Times New Roman"/>
+          <w:b/>
+          <w:bCs/>
+          <w:sz w:val="26"/>
+          <w:szCs w:val="26"/>
+        </w:rPr>
+        <w:t>5.51s</w:t>
+      </w:r>
+      <w:r>
+        <w:rPr>
+          <w:rFonts w:hint="default" w:ascii="Times New Roman" w:hAnsi="Times New Roman" w:cs="Times New Roman"/>
+          <w:sz w:val="26"/>
+          <w:szCs w:val="26"/>
+        </w:rPr>
+        <w:t xml:space="preserve"> is considered optimal for a complex Retrieval-Augmented Generation (RAG) pipeline involving both Graph traversal (Neo4j) and Vector similarity search (Embedding). The system processed </w:t>
+      </w:r>
+      <w:r>
+        <w:rPr>
+          <w:rFonts w:hint="default" w:ascii="Times New Roman" w:hAnsi="Times New Roman" w:cs="Times New Roman"/>
+          <w:b/>
+          <w:bCs/>
+          <w:sz w:val="26"/>
+          <w:szCs w:val="26"/>
+        </w:rPr>
+        <w:t>848 consecutive requests</w:t>
+      </w:r>
+      <w:r>
+        <w:rPr>
+          <w:rFonts w:hint="default" w:ascii="Times New Roman" w:hAnsi="Times New Roman" w:cs="Times New Roman"/>
+          <w:sz w:val="26"/>
+          <w:szCs w:val="26"/>
+        </w:rPr>
+        <w:t xml:space="preserve"> without a single failure, validating the logic stability of the </w:t>
+      </w:r>
+      <w:r>
+        <w:rPr>
+          <w:rStyle w:val="13"/>
+          <w:rFonts w:hint="default" w:ascii="Times New Roman" w:hAnsi="Times New Roman" w:cs="Times New Roman"/>
+          <w:sz w:val="26"/>
+          <w:szCs w:val="26"/>
+        </w:rPr>
+        <w:t>Unified Backend Server</w:t>
+      </w:r>
+      <w:r>
+        <w:rPr>
+          <w:rFonts w:hint="default" w:ascii="Times New Roman" w:hAnsi="Times New Roman" w:cs="Times New Roman"/>
+          <w:sz w:val="26"/>
+          <w:szCs w:val="26"/>
+        </w:rPr>
+        <w:t>.</w:t>
+      </w:r>
+    </w:p>
+    <w:p>
+      <w:pPr>
+        <w:pStyle w:val="15"/>
+        <w:keepNext w:val="0"/>
+        <w:keepLines w:val="0"/>
+        <w:widowControl/>
+        <w:suppressLineNumbers w:val="0"/>
+        <w:spacing w:beforeAutospacing="1"/>
+        <w:rPr>
+          <w:rFonts w:hint="default" w:ascii="Times New Roman" w:hAnsi="Times New Roman" w:cs="Times New Roman"/>
+          <w:sz w:val="26"/>
+          <w:szCs w:val="26"/>
+        </w:rPr>
+      </w:pPr>
+      <w:r>
+        <w:rPr>
+          <w:rFonts w:hint="default" w:ascii="Times New Roman" w:hAnsi="Times New Roman" w:cs="Times New Roman"/>
+          <w:b/>
+          <w:bCs/>
+          <w:sz w:val="26"/>
+          <w:szCs w:val="26"/>
+        </w:rPr>
+        <w:t>Analysis of Phase 2 (Service Denial):</w:t>
+      </w:r>
+      <w:r>
+        <w:rPr>
+          <w:rFonts w:hint="default" w:ascii="Times New Roman" w:hAnsi="Times New Roman" w:cs="Times New Roman"/>
+          <w:sz w:val="26"/>
+          <w:szCs w:val="26"/>
+        </w:rPr>
+        <w:t xml:space="preserve"> Post-09:24 AM, the system encountered a hard stop with consecutive </w:t>
+      </w:r>
+      <w:r>
+        <w:rPr>
+          <w:rStyle w:val="13"/>
+          <w:rFonts w:hint="default" w:ascii="Times New Roman" w:hAnsi="Times New Roman" w:cs="Times New Roman"/>
+          <w:sz w:val="26"/>
+          <w:szCs w:val="26"/>
+        </w:rPr>
+        <w:t>TIMEOUT</w:t>
+      </w:r>
+      <w:r>
+        <w:rPr>
+          <w:rFonts w:hint="default" w:ascii="Times New Roman" w:hAnsi="Times New Roman" w:cs="Times New Roman"/>
+          <w:sz w:val="26"/>
+          <w:szCs w:val="26"/>
+        </w:rPr>
+        <w:t xml:space="preserve"> errors. Cross-referencing with the LLM Provider's dashboard (Google AI Studio) confirmed that the daily quota of </w:t>
+      </w:r>
+      <w:r>
+        <w:rPr>
+          <w:rFonts w:hint="default" w:ascii="Times New Roman" w:hAnsi="Times New Roman" w:cs="Times New Roman"/>
+          <w:b/>
+          <w:bCs/>
+          <w:sz w:val="26"/>
+          <w:szCs w:val="26"/>
+        </w:rPr>
+        <w:t>~1,040 requests</w:t>
+      </w:r>
+      <w:r>
+        <w:rPr>
+          <w:rFonts w:hint="default" w:ascii="Times New Roman" w:hAnsi="Times New Roman" w:cs="Times New Roman"/>
+          <w:sz w:val="26"/>
+          <w:szCs w:val="26"/>
+        </w:rPr>
+        <w:t xml:space="preserve"> had been exhausted. This resulted in a </w:t>
+      </w:r>
+      <w:r>
+        <w:rPr>
+          <w:rFonts w:hint="default" w:ascii="Times New Roman" w:hAnsi="Times New Roman" w:cs="Times New Roman"/>
+          <w:b/>
+          <w:bCs/>
+          <w:sz w:val="26"/>
+          <w:szCs w:val="26"/>
+        </w:rPr>
+        <w:t>Rate Limit (HTTP 429)</w:t>
+      </w:r>
+      <w:r>
+        <w:rPr>
+          <w:rFonts w:hint="default" w:ascii="Times New Roman" w:hAnsi="Times New Roman" w:cs="Times New Roman"/>
+          <w:sz w:val="26"/>
+          <w:szCs w:val="26"/>
+        </w:rPr>
+        <w:t xml:space="preserve"> enforcement, preventing further inference processing.</w:t>
+      </w:r>
+    </w:p>
+    <w:p>
+      <w:pPr>
+        <w:bidi w:val="0"/>
+        <w:jc w:val="center"/>
+      </w:pPr>
+      <w:r>
+        <w:drawing>
+          <wp:inline distT="0" distB="0" distL="114300" distR="114300">
+            <wp:extent cx="5377815" cy="3898265"/>
+            <wp:effectExtent l="0" t="0" r="1905" b="3175"/>
+            <wp:docPr id="18" name="Picture 1"/>
+            <wp:cNvGraphicFramePr>
+              <a:graphicFrameLocks xmlns:a="http://schemas.openxmlformats.org/drawingml/2006/main" noChangeAspect="1"/>
+            </wp:cNvGraphicFramePr>
+            <a:graphic xmlns:a="http://schemas.openxmlformats.org/drawingml/2006/main">
+              <a:graphicData uri="http://schemas.openxmlformats.org/drawingml/2006/picture">
+                <pic:pic xmlns:pic="http://schemas.openxmlformats.org/drawingml/2006/picture">
+                  <pic:nvPicPr>
+                    <pic:cNvPr id="18" name="Picture 1"/>
+                    <pic:cNvPicPr>
+                      <a:picLocks noChangeAspect="1"/>
+                    </pic:cNvPicPr>
+                  </pic:nvPicPr>
+                  <pic:blipFill>
+                    <a:blip r:embed="rId23"/>
+                    <a:stretch>
+                      <a:fillRect/>
+                    </a:stretch>
+                  </pic:blipFill>
+                  <pic:spPr>
+                    <a:xfrm>
+                      <a:off x="0" y="0"/>
+                      <a:ext cx="5377815" cy="3898265"/>
+                    </a:xfrm>
+                    <a:prstGeom prst="rect">
+                      <a:avLst/>
+                    </a:prstGeom>
+                    <a:noFill/>
+                    <a:ln>
+                      <a:noFill/>
+                    </a:ln>
+                  </pic:spPr>
+                </pic:pic>
+              </a:graphicData>
+            </a:graphic>
+          </wp:inline>
+        </w:drawing>
+      </w:r>
+    </w:p>
+    <w:p>
+      <w:pPr>
+        <w:pStyle w:val="10"/>
+        <w:keepNext w:val="0"/>
+        <w:keepLines w:val="0"/>
+        <w:widowControl/>
+        <w:numPr>
+          <w:ilvl w:val="0"/>
+          <w:numId w:val="0"/>
+        </w:numPr>
+        <w:suppressLineNumbers w:val="0"/>
+        <w:spacing w:beforeAutospacing="1"/>
+        <w:jc w:val="center"/>
+        <w:rPr>
+          <w:rFonts w:hint="default"/>
+          <w:lang w:val="en-US"/>
+        </w:rPr>
+      </w:pPr>
+      <w:r>
+        <w:t xml:space="preserve">Image </w:t>
+      </w:r>
+      <w:r>
+        <w:rPr>
+          <w:rFonts w:hint="default"/>
+          <w:lang w:val="en-US"/>
+        </w:rPr>
+        <w:t>6.3 Gemini API Request limit</w:t>
+      </w:r>
+    </w:p>
+    <w:p>
+      <w:pPr>
+        <w:pStyle w:val="4"/>
+        <w:keepNext w:val="0"/>
+        <w:keepLines w:val="0"/>
+        <w:widowControl/>
+        <w:suppressLineNumbers w:val="0"/>
+        <w:rPr>
+          <w:sz w:val="26"/>
+          <w:szCs w:val="26"/>
+        </w:rPr>
+      </w:pPr>
+      <w:r>
+        <w:rPr>
+          <w:sz w:val="26"/>
+          <w:szCs w:val="26"/>
+        </w:rPr>
+        <w:t>6.4.3. Resource Utilization &amp; Memory Safety</w:t>
+      </w:r>
+    </w:p>
+    <w:p>
+      <w:pPr>
+        <w:pStyle w:val="15"/>
+        <w:keepNext w:val="0"/>
+        <w:keepLines w:val="0"/>
+        <w:widowControl/>
+        <w:suppressLineNumbers w:val="0"/>
+        <w:spacing w:beforeAutospacing="1"/>
+        <w:rPr>
+          <w:sz w:val="26"/>
+          <w:szCs w:val="26"/>
+        </w:rPr>
+      </w:pPr>
+      <w:r>
+        <w:rPr>
+          <w:sz w:val="26"/>
+          <w:szCs w:val="26"/>
+        </w:rPr>
+        <w:t>A critical objective of Soak Testing is to detect Memory Leaks—a common failure in Python-based services where memory is not released after execution, leading to eventual crashes.</w:t>
+      </w:r>
+    </w:p>
+    <w:p>
+      <w:pPr>
+        <w:pStyle w:val="15"/>
+        <w:keepNext w:val="0"/>
+        <w:keepLines w:val="0"/>
+        <w:widowControl/>
+        <w:suppressLineNumbers w:val="0"/>
+        <w:spacing w:beforeAutospacing="1"/>
+        <w:rPr>
+          <w:sz w:val="26"/>
+          <w:szCs w:val="26"/>
+        </w:rPr>
+      </w:pPr>
+      <w:r>
+        <w:rPr>
+          <w:b/>
+          <w:bCs/>
+          <w:sz w:val="26"/>
+          <w:szCs w:val="26"/>
+        </w:rPr>
+        <w:t>Figure 6.10</w:t>
+      </w:r>
+      <w:r>
+        <w:rPr>
+          <w:sz w:val="26"/>
+          <w:szCs w:val="26"/>
+        </w:rPr>
+        <w:t xml:space="preserve"> illustrates the system's memory footprint over the 24-hour period:</w:t>
+      </w:r>
+    </w:p>
+    <w:p>
+      <w:pPr>
+        <w:pStyle w:val="15"/>
+        <w:keepNext w:val="0"/>
+        <w:keepLines w:val="0"/>
+        <w:widowControl/>
+        <w:suppressLineNumbers w:val="0"/>
+        <w:spacing w:beforeAutospacing="1"/>
+        <w:ind w:left="720"/>
+        <w:rPr>
+          <w:sz w:val="26"/>
+          <w:szCs w:val="26"/>
+        </w:rPr>
+      </w:pPr>
+      <w:r>
+        <w:rPr>
+          <w:b/>
+          <w:bCs/>
+          <w:sz w:val="26"/>
+          <w:szCs w:val="26"/>
+        </w:rPr>
+        <w:t>Average RAM Usage:</w:t>
+      </w:r>
+      <w:r>
+        <w:rPr>
+          <w:sz w:val="26"/>
+          <w:szCs w:val="26"/>
+        </w:rPr>
+        <w:t xml:space="preserve"> 12.18 GB (Standard Deviation: 1.32 GB).</w:t>
+      </w:r>
+    </w:p>
+    <w:p>
+      <w:pPr>
+        <w:pStyle w:val="15"/>
+        <w:keepNext w:val="0"/>
+        <w:keepLines w:val="0"/>
+        <w:widowControl/>
+        <w:suppressLineNumbers w:val="0"/>
+        <w:spacing w:beforeAutospacing="1"/>
+        <w:ind w:left="720"/>
+        <w:rPr>
+          <w:sz w:val="26"/>
+          <w:szCs w:val="26"/>
+        </w:rPr>
+      </w:pPr>
+      <w:r>
+        <w:rPr>
+          <w:b/>
+          <w:bCs/>
+          <w:sz w:val="26"/>
+          <w:szCs w:val="26"/>
+        </w:rPr>
+        <w:t>Behavior:</w:t>
+      </w:r>
+      <w:r>
+        <w:rPr>
+          <w:sz w:val="26"/>
+          <w:szCs w:val="26"/>
+        </w:rPr>
+        <w:t xml:space="preserve"> The memory usage fluctuated within a controlled range (9.88 GB – 15.29 GB) corresponding to the complexity of individual queries (e.g., Image processing vs. Text search).</w:t>
+      </w:r>
+    </w:p>
+    <w:p>
+      <w:pPr>
+        <w:pStyle w:val="15"/>
+        <w:keepNext w:val="0"/>
+        <w:keepLines w:val="0"/>
+        <w:widowControl/>
+        <w:suppressLineNumbers w:val="0"/>
+        <w:spacing w:beforeAutospacing="1"/>
+        <w:ind w:left="720"/>
+        <w:rPr>
+          <w:sz w:val="26"/>
+          <w:szCs w:val="26"/>
+        </w:rPr>
+      </w:pPr>
+      <w:r>
+        <w:rPr>
+          <w:b/>
+          <w:bCs/>
+          <w:sz w:val="26"/>
+          <w:szCs w:val="26"/>
+        </w:rPr>
+        <w:t>Conclusion:</w:t>
+      </w:r>
+      <w:r>
+        <w:rPr>
+          <w:sz w:val="26"/>
+          <w:szCs w:val="26"/>
+        </w:rPr>
+        <w:t xml:space="preserve"> Crucially, there was </w:t>
+      </w:r>
+      <w:r>
+        <w:rPr>
+          <w:b/>
+          <w:bCs/>
+          <w:sz w:val="26"/>
+          <w:szCs w:val="26"/>
+        </w:rPr>
+        <w:t>no linear growth</w:t>
+      </w:r>
+      <w:r>
+        <w:rPr>
+          <w:sz w:val="26"/>
+          <w:szCs w:val="26"/>
+        </w:rPr>
+        <w:t xml:space="preserve"> in memory consumption. The Garbage Collection (GC) mechanism functioned correctly, releasing resources after each request cycle. The system proved capable of running indefinitely if the external API quota were not a limiting factor.</w:t>
+      </w:r>
+    </w:p>
+    <w:p>
+      <w:pPr>
+        <w:pStyle w:val="15"/>
+        <w:keepNext w:val="0"/>
+        <w:keepLines w:val="0"/>
+        <w:widowControl/>
+        <w:suppressLineNumbers w:val="0"/>
+        <w:spacing w:beforeAutospacing="1"/>
+        <w:jc w:val="center"/>
+        <w:rPr>
+          <w:rFonts w:hint="default"/>
+          <w:sz w:val="26"/>
+          <w:szCs w:val="26"/>
+          <w:lang w:val="en-US"/>
+        </w:rPr>
+      </w:pPr>
+      <w:r>
+        <w:rPr>
+          <w:rFonts w:hint="default"/>
+          <w:sz w:val="26"/>
+          <w:szCs w:val="26"/>
+          <w:lang w:val="en-US"/>
+        </w:rPr>
+        <w:drawing>
+          <wp:inline distT="0" distB="0" distL="114300" distR="114300">
+            <wp:extent cx="4834890" cy="2399665"/>
+            <wp:effectExtent l="0" t="0" r="11430" b="8255"/>
+            <wp:docPr id="22" name="Picture 22" descr="thucnghiem24h"/>
+            <wp:cNvGraphicFramePr>
+              <a:graphicFrameLocks xmlns:a="http://schemas.openxmlformats.org/drawingml/2006/main" noChangeAspect="1"/>
+            </wp:cNvGraphicFramePr>
+            <a:graphic xmlns:a="http://schemas.openxmlformats.org/drawingml/2006/main">
+              <a:graphicData uri="http://schemas.openxmlformats.org/drawingml/2006/picture">
+                <pic:pic xmlns:pic="http://schemas.openxmlformats.org/drawingml/2006/picture">
+                  <pic:nvPicPr>
+                    <pic:cNvPr id="22" name="Picture 22" descr="thucnghiem24h"/>
+                    <pic:cNvPicPr>
+                      <a:picLocks noChangeAspect="1"/>
+                    </pic:cNvPicPr>
+                  </pic:nvPicPr>
+                  <pic:blipFill>
+                    <a:blip r:embed="rId24"/>
+                    <a:stretch>
+                      <a:fillRect/>
+                    </a:stretch>
+                  </pic:blipFill>
+                  <pic:spPr>
+                    <a:xfrm>
+                      <a:off x="0" y="0"/>
+                      <a:ext cx="4834890" cy="2399665"/>
+                    </a:xfrm>
+                    <a:prstGeom prst="rect">
+                      <a:avLst/>
+                    </a:prstGeom>
+                  </pic:spPr>
+                </pic:pic>
+              </a:graphicData>
+            </a:graphic>
+          </wp:inline>
+        </w:drawing>
+      </w:r>
+    </w:p>
+    <w:p>
+      <w:pPr>
+        <w:pStyle w:val="10"/>
+        <w:keepNext w:val="0"/>
+        <w:keepLines w:val="0"/>
+        <w:widowControl/>
+        <w:numPr>
+          <w:ilvl w:val="0"/>
+          <w:numId w:val="0"/>
+        </w:numPr>
+        <w:suppressLineNumbers w:val="0"/>
+        <w:spacing w:beforeAutospacing="1"/>
+        <w:jc w:val="center"/>
+        <w:rPr>
+          <w:rFonts w:hint="default" w:ascii="Times New Roman" w:hAnsi="Times New Roman" w:cs="Times New Roman"/>
+          <w:sz w:val="20"/>
+          <w:szCs w:val="20"/>
+          <w:lang w:val="en-US"/>
+        </w:rPr>
+      </w:pPr>
+      <w:r>
+        <w:rPr>
+          <w:rFonts w:hint="default" w:ascii="Times New Roman" w:hAnsi="Times New Roman" w:cs="Times New Roman"/>
+          <w:sz w:val="20"/>
+          <w:szCs w:val="20"/>
+        </w:rPr>
+        <w:t xml:space="preserve">Image </w:t>
+      </w:r>
+      <w:r>
+        <w:rPr>
+          <w:rFonts w:hint="default" w:ascii="Times New Roman" w:hAnsi="Times New Roman" w:cs="Times New Roman"/>
+          <w:sz w:val="20"/>
+          <w:szCs w:val="20"/>
+          <w:lang w:val="en-US"/>
+        </w:rPr>
+        <w:t>6.4</w:t>
+      </w:r>
+      <w:r>
+        <w:rPr>
+          <w:rFonts w:hint="default" w:ascii="Times New Roman" w:hAnsi="Times New Roman" w:cs="Times New Roman"/>
+          <w:sz w:val="20"/>
+          <w:szCs w:val="20"/>
+          <w:lang w:val="en-US"/>
+        </w:rPr>
+        <w:t xml:space="preserve"> </w:t>
+      </w:r>
+      <w:r>
+        <w:rPr>
+          <w:rFonts w:hint="default" w:ascii="Times New Roman" w:hAnsi="Times New Roman" w:eastAsia="SimSun" w:cs="Times New Roman"/>
+          <w:sz w:val="20"/>
+          <w:szCs w:val="20"/>
+        </w:rPr>
+        <w:t>Latency and System Resource Utilization over the 24-ho</w:t>
+      </w:r>
+      <w:bookmarkStart w:id="299" w:name="_GoBack"/>
+      <w:bookmarkEnd w:id="299"/>
+      <w:r>
+        <w:rPr>
+          <w:rFonts w:hint="default" w:ascii="Times New Roman" w:hAnsi="Times New Roman" w:eastAsia="SimSun" w:cs="Times New Roman"/>
+          <w:sz w:val="20"/>
+          <w:szCs w:val="20"/>
+        </w:rPr>
+        <w:t>ur experiment.</w:t>
+      </w:r>
+    </w:p>
+    <w:p>
+      <w:pPr>
+        <w:pStyle w:val="4"/>
+        <w:keepNext w:val="0"/>
+        <w:keepLines w:val="0"/>
+        <w:widowControl/>
+        <w:suppressLineNumbers w:val="0"/>
+        <w:rPr>
+          <w:sz w:val="26"/>
+          <w:szCs w:val="26"/>
+        </w:rPr>
+      </w:pPr>
+      <w:r>
+        <w:rPr>
+          <w:sz w:val="26"/>
+          <w:szCs w:val="26"/>
+        </w:rPr>
+        <w:t>6.4.4. Experimental Conclusion &amp; Recommendations</w:t>
+      </w:r>
+    </w:p>
+    <w:p>
+      <w:pPr>
+        <w:pStyle w:val="15"/>
+        <w:keepNext w:val="0"/>
+        <w:keepLines w:val="0"/>
+        <w:widowControl/>
+        <w:suppressLineNumbers w:val="0"/>
+        <w:spacing w:beforeAutospacing="1"/>
+        <w:rPr>
+          <w:sz w:val="26"/>
+          <w:szCs w:val="26"/>
+        </w:rPr>
+      </w:pPr>
+      <w:r>
+        <w:rPr>
+          <w:sz w:val="26"/>
+          <w:szCs w:val="26"/>
+        </w:rPr>
+        <w:t>The 24-hour endurance test provides conclusive evidence regarding the system's readiness level:</w:t>
+      </w:r>
+    </w:p>
+    <w:p>
+      <w:pPr>
+        <w:pStyle w:val="15"/>
+        <w:keepNext w:val="0"/>
+        <w:keepLines w:val="0"/>
+        <w:widowControl/>
+        <w:suppressLineNumbers w:val="0"/>
+        <w:spacing w:beforeAutospacing="1"/>
+        <w:ind w:left="720"/>
+        <w:rPr>
+          <w:sz w:val="26"/>
+          <w:szCs w:val="26"/>
+        </w:rPr>
+      </w:pPr>
+      <w:r>
+        <w:rPr>
+          <w:b/>
+          <w:bCs/>
+          <w:sz w:val="26"/>
+          <w:szCs w:val="26"/>
+        </w:rPr>
+        <w:t>Software Maturity (PASSED):</w:t>
+      </w:r>
+      <w:r>
+        <w:rPr>
+          <w:sz w:val="26"/>
+          <w:szCs w:val="26"/>
+        </w:rPr>
+        <w:t xml:space="preserve"> The core application architecture is stable. It sustained </w:t>
+      </w:r>
+      <w:r>
+        <w:rPr>
+          <w:b/>
+          <w:bCs/>
+          <w:sz w:val="26"/>
+          <w:szCs w:val="26"/>
+        </w:rPr>
+        <w:t>~12 hours of continuous uptime</w:t>
+      </w:r>
+      <w:r>
+        <w:rPr>
+          <w:sz w:val="26"/>
+          <w:szCs w:val="26"/>
+        </w:rPr>
+        <w:t xml:space="preserve"> and processed nearly 1,000 complex queries without internal errors or memory leaks.</w:t>
+      </w:r>
+    </w:p>
+    <w:p>
+      <w:pPr>
+        <w:pStyle w:val="15"/>
+        <w:keepNext w:val="0"/>
+        <w:keepLines w:val="0"/>
+        <w:widowControl/>
+        <w:suppressLineNumbers w:val="0"/>
+        <w:spacing w:beforeAutospacing="1"/>
+        <w:ind w:left="720"/>
+        <w:rPr>
+          <w:sz w:val="26"/>
+          <w:szCs w:val="26"/>
+        </w:rPr>
+      </w:pPr>
+      <w:r>
+        <w:rPr>
+          <w:b/>
+          <w:bCs/>
+          <w:sz w:val="26"/>
+          <w:szCs w:val="26"/>
+        </w:rPr>
+        <w:t>Hardware Capability (PASSED):</w:t>
+      </w:r>
+      <w:r>
+        <w:rPr>
+          <w:sz w:val="26"/>
+          <w:szCs w:val="26"/>
+        </w:rPr>
+        <w:t xml:space="preserve"> The Edge Node (Acer Nitro 5) successfully handled the computational load of the Vector Embedding model and Application Server without thermal throttling.</w:t>
+      </w:r>
+    </w:p>
+    <w:p>
+      <w:pPr>
+        <w:pStyle w:val="15"/>
+        <w:keepNext w:val="0"/>
+        <w:keepLines w:val="0"/>
+        <w:widowControl/>
+        <w:suppressLineNumbers w:val="0"/>
+        <w:spacing w:beforeAutospacing="1"/>
+        <w:ind w:left="720"/>
+        <w:rPr>
+          <w:sz w:val="26"/>
+          <w:szCs w:val="26"/>
+        </w:rPr>
+      </w:pPr>
+      <w:r>
+        <w:rPr>
+          <w:b/>
+          <w:bCs/>
+          <w:sz w:val="26"/>
+          <w:szCs w:val="26"/>
+        </w:rPr>
+        <w:t>Deployment Constraint (IDENTIFIED):</w:t>
+      </w:r>
+      <w:r>
+        <w:rPr>
+          <w:sz w:val="26"/>
+          <w:szCs w:val="26"/>
+        </w:rPr>
+        <w:t xml:space="preserve"> The observed interruption after 12 hours is strictly due to the </w:t>
+      </w:r>
+      <w:r>
+        <w:rPr>
+          <w:b/>
+          <w:bCs/>
+          <w:sz w:val="26"/>
+          <w:szCs w:val="26"/>
+        </w:rPr>
+        <w:t>Free Tier Policy</w:t>
+      </w:r>
+      <w:r>
+        <w:rPr>
+          <w:sz w:val="26"/>
+          <w:szCs w:val="26"/>
+        </w:rPr>
+        <w:t xml:space="preserve"> of the LLM Provider (Google Gemini), not a system defect.</w:t>
+      </w:r>
+    </w:p>
+    <w:p>
+      <w:pPr>
+        <w:pStyle w:val="15"/>
+        <w:keepNext w:val="0"/>
+        <w:keepLines w:val="0"/>
+        <w:widowControl/>
+        <w:suppressLineNumbers w:val="0"/>
+        <w:spacing w:beforeAutospacing="1"/>
+        <w:rPr>
+          <w:sz w:val="26"/>
+          <w:szCs w:val="26"/>
+        </w:rPr>
+      </w:pPr>
+      <w:r>
+        <w:rPr>
+          <w:b/>
+          <w:bCs/>
+          <w:sz w:val="26"/>
+          <w:szCs w:val="26"/>
+        </w:rPr>
+        <w:t>Strategic Recommendation:</w:t>
+      </w:r>
+      <w:r>
+        <w:rPr>
+          <w:sz w:val="26"/>
+          <w:szCs w:val="26"/>
+        </w:rPr>
+        <w:t xml:space="preserve"> To transition from the current Pilot Phase to Commercial Deployment (Production), the following infrastructure upgrades are proposed:</w:t>
+      </w:r>
+    </w:p>
+    <w:p>
+      <w:pPr>
+        <w:pStyle w:val="15"/>
+        <w:keepNext w:val="0"/>
+        <w:keepLines w:val="0"/>
+        <w:widowControl/>
+        <w:suppressLineNumbers w:val="0"/>
+        <w:spacing w:beforeAutospacing="1"/>
+        <w:ind w:left="720"/>
+        <w:rPr>
+          <w:sz w:val="26"/>
+          <w:szCs w:val="26"/>
+        </w:rPr>
+      </w:pPr>
+      <w:r>
+        <w:rPr>
+          <w:b/>
+          <w:bCs/>
+          <w:sz w:val="26"/>
+          <w:szCs w:val="26"/>
+        </w:rPr>
+        <w:t>API Upgrade:</w:t>
+      </w:r>
+      <w:r>
+        <w:rPr>
+          <w:sz w:val="26"/>
+          <w:szCs w:val="26"/>
+        </w:rPr>
+        <w:t xml:space="preserve"> Migration to Google Vertex AI (Pay-as-you-go) to remove the 1,500 requests/day cap.</w:t>
+      </w:r>
+    </w:p>
+    <w:p>
+      <w:pPr>
+        <w:pStyle w:val="15"/>
+        <w:keepNext w:val="0"/>
+        <w:keepLines w:val="0"/>
+        <w:widowControl/>
+        <w:suppressLineNumbers w:val="0"/>
+        <w:spacing w:beforeAutospacing="1"/>
+        <w:ind w:left="720"/>
+        <w:rPr>
+          <w:rFonts w:hint="default"/>
+          <w:sz w:val="26"/>
+          <w:szCs w:val="26"/>
+          <w:lang w:val="en-US"/>
+        </w:rPr>
+      </w:pPr>
+      <w:r>
+        <w:rPr>
+          <w:b/>
+          <w:bCs/>
+          <w:sz w:val="26"/>
+          <w:szCs w:val="26"/>
+        </w:rPr>
+        <w:t>Load Balancing:</w:t>
+      </w:r>
+      <w:r>
+        <w:rPr>
+          <w:sz w:val="26"/>
+          <w:szCs w:val="26"/>
+        </w:rPr>
+        <w:t xml:space="preserve"> Implementation of a Round-Robin Key Rotation strategy to distribute the workload across multiple accounts, ensuring 24/7 availability.</w:t>
       </w:r>
     </w:p>
     <w:bookmarkEnd w:id="189"/>
@@ -44139,7 +46730,7 @@
                     </pic:cNvPicPr>
                   </pic:nvPicPr>
                   <pic:blipFill>
-                    <a:blip r:embed="rId23"/>
+                    <a:blip r:embed="rId25"/>
                     <a:stretch>
                       <a:fillRect/>
                     </a:stretch>
@@ -44216,8 +46807,8 @@
         </w:rPr>
         <w:fldChar w:fldCharType="end"/>
       </w:r>
-      <w:bookmarkStart w:id="258" w:name="_Toc12475"/>
-      <w:bookmarkStart w:id="259" w:name="_Toc16373"/>
+      <w:bookmarkStart w:id="258" w:name="_Toc16373"/>
+      <w:bookmarkStart w:id="259" w:name="_Toc12475"/>
       <w:r>
         <w:rPr>
           <w:rFonts w:hint="default" w:ascii="Times New Roman" w:hAnsi="Times New Roman" w:cs="Times New Roman"/>
@@ -44251,7 +46842,7 @@
                     </pic:cNvPicPr>
                   </pic:nvPicPr>
                   <pic:blipFill>
-                    <a:blip r:embed="rId24"/>
+                    <a:blip r:embed="rId26"/>
                     <a:stretch>
                       <a:fillRect/>
                     </a:stretch>
@@ -44451,7 +47042,7 @@
                     </pic:cNvPicPr>
                   </pic:nvPicPr>
                   <pic:blipFill>
-                    <a:blip r:embed="rId25"/>
+                    <a:blip r:embed="rId27"/>
                     <a:stretch>
                       <a:fillRect/>
                     </a:stretch>
@@ -44563,7 +47154,7 @@
                     </pic:cNvPicPr>
                   </pic:nvPicPr>
                   <pic:blipFill>
-                    <a:blip r:embed="rId26"/>
+                    <a:blip r:embed="rId28"/>
                     <a:stretch>
                       <a:fillRect/>
                     </a:stretch>
@@ -44640,8 +47231,8 @@
         </w:rPr>
         <w:fldChar w:fldCharType="end"/>
       </w:r>
-      <w:bookmarkStart w:id="265" w:name="_Toc21120"/>
-      <w:bookmarkStart w:id="266" w:name="_Toc23005"/>
+      <w:bookmarkStart w:id="265" w:name="_Toc23005"/>
+      <w:bookmarkStart w:id="266" w:name="_Toc21120"/>
       <w:r>
         <w:rPr>
           <w:rFonts w:hint="default" w:ascii="Times New Roman" w:hAnsi="Times New Roman" w:cs="Times New Roman"/>
@@ -44763,7 +47354,7 @@
                     </pic:cNvPicPr>
                   </pic:nvPicPr>
                   <pic:blipFill>
-                    <a:blip r:embed="rId27"/>
+                    <a:blip r:embed="rId29"/>
                     <a:stretch>
                       <a:fillRect/>
                     </a:stretch>
@@ -44840,8 +47431,8 @@
         </w:rPr>
         <w:fldChar w:fldCharType="end"/>
       </w:r>
-      <w:bookmarkStart w:id="268" w:name="_Toc23083"/>
-      <w:bookmarkStart w:id="269" w:name="_Toc7220"/>
+      <w:bookmarkStart w:id="268" w:name="_Toc7220"/>
+      <w:bookmarkStart w:id="269" w:name="_Toc23083"/>
       <w:r>
         <w:rPr>
           <w:rFonts w:hint="default" w:ascii="Times New Roman" w:hAnsi="Times New Roman" w:cs="Times New Roman"/>
@@ -44963,7 +47554,7 @@
                     </pic:cNvPicPr>
                   </pic:nvPicPr>
                   <pic:blipFill>
-                    <a:blip r:embed="rId28"/>
+                    <a:blip r:embed="rId30"/>
                     <a:stretch>
                       <a:fillRect/>
                     </a:stretch>
@@ -45075,7 +47666,7 @@
                     </pic:cNvPicPr>
                   </pic:nvPicPr>
                   <pic:blipFill>
-                    <a:blip r:embed="rId29"/>
+                    <a:blip r:embed="rId31"/>
                     <a:stretch>
                       <a:fillRect/>
                     </a:stretch>
@@ -45152,8 +47743,8 @@
         </w:rPr>
         <w:fldChar w:fldCharType="end"/>
       </w:r>
-      <w:bookmarkStart w:id="273" w:name="_Toc19107"/>
-      <w:bookmarkStart w:id="274" w:name="_Toc23494"/>
+      <w:bookmarkStart w:id="273" w:name="_Toc23494"/>
+      <w:bookmarkStart w:id="274" w:name="_Toc19107"/>
       <w:r>
         <w:rPr>
           <w:rFonts w:hint="default" w:ascii="Times New Roman" w:hAnsi="Times New Roman" w:cs="Times New Roman"/>
@@ -48170,8 +50761,8 @@
     <w:lsdException w:qFormat="1" w:unhideWhenUsed="0" w:uiPriority="39" w:semiHidden="0" w:name="Table Grid"/>
     <w:lsdException w:uiPriority="0" w:name="Table Theme"/>
     <w:lsdException w:unhideWhenUsed="0" w:uiPriority="60" w:semiHidden="0" w:name="Light Shading"/>
-    <w:lsdException w:qFormat="1" w:unhideWhenUsed="0" w:uiPriority="61" w:semiHidden="0" w:name="Light List"/>
-    <w:lsdException w:qFormat="1" w:unhideWhenUsed="0" w:uiPriority="62" w:semiHidden="0" w:name="Light Grid"/>
+    <w:lsdException w:unhideWhenUsed="0" w:uiPriority="61" w:semiHidden="0" w:name="Light List"/>
+    <w:lsdException w:unhideWhenUsed="0" w:uiPriority="62" w:semiHidden="0" w:name="Light Grid"/>
     <w:lsdException w:unhideWhenUsed="0" w:uiPriority="63" w:semiHidden="0" w:name="Medium Shading 1"/>
     <w:lsdException w:unhideWhenUsed="0" w:uiPriority="64" w:semiHidden="0" w:name="Medium Shading 2"/>
     <w:lsdException w:unhideWhenUsed="0" w:uiPriority="65" w:semiHidden="0" w:name="Medium List 1"/>
@@ -48198,7 +50789,7 @@
     <w:lsdException w:unhideWhenUsed="0" w:uiPriority="72" w:semiHidden="0" w:name="Colorful List Accent 1"/>
     <w:lsdException w:unhideWhenUsed="0" w:uiPriority="73" w:semiHidden="0" w:name="Colorful Grid Accent 1"/>
     <w:lsdException w:unhideWhenUsed="0" w:uiPriority="60" w:semiHidden="0" w:name="Light Shading Accent 2"/>
-    <w:lsdException w:qFormat="1" w:unhideWhenUsed="0" w:uiPriority="61" w:semiHidden="0" w:name="Light List Accent 2"/>
+    <w:lsdException w:unhideWhenUsed="0" w:uiPriority="61" w:semiHidden="0" w:name="Light List Accent 2"/>
     <w:lsdException w:unhideWhenUsed="0" w:uiPriority="62" w:semiHidden="0" w:name="Light Grid Accent 2"/>
     <w:lsdException w:unhideWhenUsed="0" w:uiPriority="63" w:semiHidden="0" w:name="Medium Shading 1 Accent 2"/>
     <w:lsdException w:unhideWhenUsed="0" w:uiPriority="64" w:semiHidden="0" w:name="Medium Shading 2 Accent 2"/>
@@ -48212,7 +50803,7 @@
     <w:lsdException w:unhideWhenUsed="0" w:uiPriority="72" w:semiHidden="0" w:name="Colorful List Accent 2"/>
     <w:lsdException w:unhideWhenUsed="0" w:uiPriority="73" w:semiHidden="0" w:name="Colorful Grid Accent 2"/>
     <w:lsdException w:unhideWhenUsed="0" w:uiPriority="60" w:semiHidden="0" w:name="Light Shading Accent 3"/>
-    <w:lsdException w:qFormat="1" w:unhideWhenUsed="0" w:uiPriority="61" w:semiHidden="0" w:name="Light List Accent 3"/>
+    <w:lsdException w:unhideWhenUsed="0" w:uiPriority="61" w:semiHidden="0" w:name="Light List Accent 3"/>
     <w:lsdException w:unhideWhenUsed="0" w:uiPriority="62" w:semiHidden="0" w:name="Light Grid Accent 3"/>
     <w:lsdException w:unhideWhenUsed="0" w:uiPriority="63" w:semiHidden="0" w:name="Medium Shading 1 Accent 3"/>
     <w:lsdException w:unhideWhenUsed="0" w:uiPriority="64" w:semiHidden="0" w:name="Medium Shading 2 Accent 3"/>
@@ -48226,11 +50817,11 @@
     <w:lsdException w:unhideWhenUsed="0" w:uiPriority="72" w:semiHidden="0" w:name="Colorful List Accent 3"/>
     <w:lsdException w:unhideWhenUsed="0" w:uiPriority="73" w:semiHidden="0" w:name="Colorful Grid Accent 3"/>
     <w:lsdException w:unhideWhenUsed="0" w:uiPriority="60" w:semiHidden="0" w:name="Light Shading Accent 4"/>
-    <w:lsdException w:qFormat="1" w:unhideWhenUsed="0" w:uiPriority="61" w:semiHidden="0" w:name="Light List Accent 4"/>
+    <w:lsdException w:unhideWhenUsed="0" w:uiPriority="61" w:semiHidden="0" w:name="Light List Accent 4"/>
     <w:lsdException w:unhideWhenUsed="0" w:uiPriority="62" w:semiHidden="0" w:name="Light Grid Accent 4"/>
     <w:lsdException w:unhideWhenUsed="0" w:uiPriority="63" w:semiHidden="0" w:name="Medium Shading 1 Accent 4"/>
     <w:lsdException w:unhideWhenUsed="0" w:uiPriority="64" w:semiHidden="0" w:name="Medium Shading 2 Accent 4"/>
-    <w:lsdException w:qFormat="1" w:unhideWhenUsed="0" w:uiPriority="65" w:semiHidden="0" w:name="Medium List 1 Accent 4"/>
+    <w:lsdException w:unhideWhenUsed="0" w:uiPriority="65" w:semiHidden="0" w:name="Medium List 1 Accent 4"/>
     <w:lsdException w:unhideWhenUsed="0" w:uiPriority="66" w:semiHidden="0" w:name="Medium List 2 Accent 4"/>
     <w:lsdException w:unhideWhenUsed="0" w:uiPriority="67" w:semiHidden="0" w:name="Medium Grid 1 Accent 4"/>
     <w:lsdException w:unhideWhenUsed="0" w:uiPriority="68" w:semiHidden="0" w:name="Medium Grid 2 Accent 4"/>
@@ -48239,9 +50830,9 @@
     <w:lsdException w:unhideWhenUsed="0" w:uiPriority="71" w:semiHidden="0" w:name="Colorful Shading Accent 4"/>
     <w:lsdException w:unhideWhenUsed="0" w:uiPriority="72" w:semiHidden="0" w:name="Colorful List Accent 4"/>
     <w:lsdException w:unhideWhenUsed="0" w:uiPriority="73" w:semiHidden="0" w:name="Colorful Grid Accent 4"/>
-    <w:lsdException w:qFormat="1" w:unhideWhenUsed="0" w:uiPriority="60" w:semiHidden="0" w:name="Light Shading Accent 5"/>
-    <w:lsdException w:qFormat="1" w:unhideWhenUsed="0" w:uiPriority="61" w:semiHidden="0" w:name="Light List Accent 5"/>
-    <w:lsdException w:qFormat="1" w:unhideWhenUsed="0" w:uiPriority="62" w:semiHidden="0" w:name="Light Grid Accent 5"/>
+    <w:lsdException w:unhideWhenUsed="0" w:uiPriority="60" w:semiHidden="0" w:name="Light Shading Accent 5"/>
+    <w:lsdException w:unhideWhenUsed="0" w:uiPriority="61" w:semiHidden="0" w:name="Light List Accent 5"/>
+    <w:lsdException w:unhideWhenUsed="0" w:uiPriority="62" w:semiHidden="0" w:name="Light Grid Accent 5"/>
     <w:lsdException w:unhideWhenUsed="0" w:uiPriority="63" w:semiHidden="0" w:name="Medium Shading 1 Accent 5"/>
     <w:lsdException w:unhideWhenUsed="0" w:uiPriority="64" w:semiHidden="0" w:name="Medium Shading 2 Accent 5"/>
     <w:lsdException w:unhideWhenUsed="0" w:uiPriority="65" w:semiHidden="0" w:name="Medium List 1 Accent 5"/>
@@ -48253,7 +50844,7 @@
     <w:lsdException w:unhideWhenUsed="0" w:uiPriority="71" w:semiHidden="0" w:name="Colorful Shading Accent 5"/>
     <w:lsdException w:unhideWhenUsed="0" w:uiPriority="72" w:semiHidden="0" w:name="Colorful List Accent 5"/>
     <w:lsdException w:unhideWhenUsed="0" w:uiPriority="73" w:semiHidden="0" w:name="Colorful Grid Accent 5"/>
-    <w:lsdException w:qFormat="1" w:unhideWhenUsed="0" w:uiPriority="60" w:semiHidden="0" w:name="Light Shading Accent 6"/>
+    <w:lsdException w:unhideWhenUsed="0" w:uiPriority="60" w:semiHidden="0" w:name="Light Shading Accent 6"/>
     <w:lsdException w:unhideWhenUsed="0" w:uiPriority="61" w:semiHidden="0" w:name="Light List Accent 6"/>
     <w:lsdException w:unhideWhenUsed="0" w:uiPriority="62" w:semiHidden="0" w:name="Light Grid Accent 6"/>
     <w:lsdException w:unhideWhenUsed="0" w:uiPriority="63" w:semiHidden="0" w:name="Medium Shading 1 Accent 6"/>

</xml_diff>